<commit_message>
doc: se corrigieron los documentos 4, 7, 8, 9, 10, 11, 12, 13, 14, 15, 17, y 20
</commit_message>
<xml_diff>
--- a/2-ELABORACION/ITERACIÓN 1/11. Plan de Riesgo/D11-Plan de Gestión de Riesgos-GRCU-4BYTES.docx
+++ b/2-ELABORACION/ITERACIÓN 1/11. Plan de Riesgo/D11-Plan de Gestión de Riesgos-GRCU-4BYTES.docx
@@ -1,6 +1,6 @@
 
 <file path=word/document.xml><?xml version="1.0" encoding="utf-8"?>
-<w:document xmlns:wpc="http://schemas.microsoft.com/office/word/2010/wordprocessingCanvas" xmlns:cx="http://schemas.microsoft.com/office/drawing/2014/chartex" xmlns:cx1="http://schemas.microsoft.com/office/drawing/2015/9/8/chartex" xmlns:cx2="http://schemas.microsoft.com/office/drawing/2015/10/21/chartex" xmlns:cx3="http://schemas.microsoft.com/office/drawing/2016/5/9/chartex" xmlns:cx4="http://schemas.microsoft.com/office/drawing/2016/5/10/chartex" xmlns:cx5="http://schemas.microsoft.com/office/drawing/2016/5/11/chartex" xmlns:cx6="http://schemas.microsoft.com/office/drawing/2016/5/12/chartex" xmlns:cx7="http://schemas.microsoft.com/office/drawing/2016/5/13/chartex" xmlns:cx8="http://schemas.microsoft.com/office/drawing/2016/5/14/chartex" xmlns:mc="http://schemas.openxmlformats.org/markup-compatibility/2006" xmlns:aink="http://schemas.microsoft.com/office/drawing/2016/ink" xmlns:am3d="http://schemas.microsoft.com/office/drawing/2017/model3d" xmlns:o="urn:schemas-microsoft-com:office:office" xmlns:oel="http://schemas.microsoft.com/office/2019/extlst" xmlns:r="http://schemas.openxmlformats.org/officeDocument/2006/relationships" xmlns:m="http://schemas.openxmlformats.org/officeDocument/2006/math" xmlns:v="urn:schemas-microsoft-com:vml" xmlns:wp14="http://schemas.microsoft.com/office/word/2010/wordprocessingDrawing" xmlns:wp="http://schemas.openxmlformats.org/drawingml/2006/wordprocessingDrawing" xmlns:w10="urn:schemas-microsoft-com:office:word" xmlns:w="http://schemas.openxmlformats.org/wordprocessingml/2006/main" xmlns:w14="http://schemas.microsoft.com/office/word/2010/wordml" xmlns:w15="http://schemas.microsoft.com/office/word/2012/wordml" xmlns:w16cex="http://schemas.microsoft.com/office/word/2018/wordml/cex" xmlns:w16cid="http://schemas.microsoft.com/office/word/2016/wordml/cid" xmlns:w16="http://schemas.microsoft.com/office/word/2018/wordml" xmlns:w16du="http://schemas.microsoft.com/office/word/2023/wordml/word16du" xmlns:w16sdtdh="http://schemas.microsoft.com/office/word/2020/wordml/sdtdatahash" xmlns:w16sdtfl="http://schemas.microsoft.com/office/word/2024/wordml/sdtformatlock" xmlns:w16se="http://schemas.microsoft.com/office/word/2015/wordml/symex" xmlns:wpg="http://schemas.microsoft.com/office/word/2010/wordprocessingGroup" xmlns:wpi="http://schemas.microsoft.com/office/word/2010/wordprocessingInk" xmlns:wne="http://schemas.microsoft.com/office/word/2006/wordml" xmlns:wps="http://schemas.microsoft.com/office/word/2010/wordprocessingShape" mc:Ignorable="w14 w15 w16se w16cid w16 w16cex w16sdtdh w16sdtfl w16du wp14">
+<w:document xmlns:wpc="http://schemas.microsoft.com/office/word/2010/wordprocessingCanvas" xmlns:cx="http://schemas.microsoft.com/office/drawing/2014/chartex" xmlns:cx1="http://schemas.microsoft.com/office/drawing/2015/9/8/chartex" xmlns:cx2="http://schemas.microsoft.com/office/drawing/2015/10/21/chartex" xmlns:cx3="http://schemas.microsoft.com/office/drawing/2016/5/9/chartex" xmlns:cx4="http://schemas.microsoft.com/office/drawing/2016/5/10/chartex" xmlns:cx5="http://schemas.microsoft.com/office/drawing/2016/5/11/chartex" xmlns:cx6="http://schemas.microsoft.com/office/drawing/2016/5/12/chartex" xmlns:cx7="http://schemas.microsoft.com/office/drawing/2016/5/13/chartex" xmlns:cx8="http://schemas.microsoft.com/office/drawing/2016/5/14/chartex" xmlns:mc="http://schemas.openxmlformats.org/markup-compatibility/2006" xmlns:aink="http://schemas.microsoft.com/office/drawing/2016/ink" xmlns:am3d="http://schemas.microsoft.com/office/drawing/2017/model3d" xmlns:o="urn:schemas-microsoft-com:office:office" xmlns:r="http://schemas.openxmlformats.org/officeDocument/2006/relationships" xmlns:m="http://schemas.openxmlformats.org/officeDocument/2006/math" xmlns:v="urn:schemas-microsoft-com:vml" xmlns:wp14="http://schemas.microsoft.com/office/word/2010/wordprocessingDrawing" xmlns:wp="http://schemas.openxmlformats.org/drawingml/2006/wordprocessingDrawing" xmlns:w10="urn:schemas-microsoft-com:office:word" xmlns:w="http://schemas.openxmlformats.org/wordprocessingml/2006/main" xmlns:w14="http://schemas.microsoft.com/office/word/2010/wordml" xmlns:w15="http://schemas.microsoft.com/office/word/2012/wordml" xmlns:w16cid="http://schemas.microsoft.com/office/word/2016/wordml/cid" xmlns:w16se="http://schemas.microsoft.com/office/word/2015/wordml/symex" xmlns:wpg="http://schemas.microsoft.com/office/word/2010/wordprocessingGroup" xmlns:wpi="http://schemas.microsoft.com/office/word/2010/wordprocessingInk" xmlns:wne="http://schemas.microsoft.com/office/word/2006/wordml" xmlns:wps="http://schemas.microsoft.com/office/word/2010/wordprocessingShape" mc:Ignorable="w14 w15 w16se w16cid wp14">
   <w:body>
     <w:p>
       <w:pPr>
@@ -64,7 +64,7 @@
           <w:color w:val="000000"/>
         </w:rPr>
         <mc:AlternateContent>
-          <mc:Choice Requires="wpg">
+          <mc:Choice Requires="wps">
             <w:drawing>
               <wp:anchor distT="0" distB="0" distL="114300" distR="114300" simplePos="0" relativeHeight="251658240" behindDoc="0" locked="0" layoutInCell="1" hidden="0" allowOverlap="1" wp14:anchorId="6CD26AC4" wp14:editId="5F56C588">
                 <wp:simplePos x="0" y="0"/>
@@ -124,47 +124,24 @@
               </wp:anchor>
             </w:drawing>
           </mc:Choice>
-          <mc:Fallback xmlns:cr="http://schemas.microsoft.com/office/comments/2020/reactions" xmlns="http://schemas.microsoft.com/office/tasks/2019/documenttasks" xmlns:dgm="http://schemas.openxmlformats.org/drawingml/2006/diagram" xmlns:lc="http://schemas.openxmlformats.org/drawingml/2006/lockedCanvas" xmlns:c="http://schemas.openxmlformats.org/drawingml/2006/chart" xmlns:pic="http://schemas.openxmlformats.org/drawingml/2006/picture" xmlns:a="http://schemas.openxmlformats.org/drawingml/2006/main" xmlns:sl="http://schemas.openxmlformats.org/schemaLibrary/2006/main">
-            <w:drawing>
-              <wp:anchor allowOverlap="1" behindDoc="0" distB="0" distT="0" distL="114300" distR="114300" hidden="0" layoutInCell="1" locked="0" relativeHeight="0" simplePos="0">
-                <wp:simplePos x="0" y="0"/>
-                <wp:positionH relativeFrom="page">
-                  <wp:posOffset>485141</wp:posOffset>
-                </wp:positionH>
-                <wp:positionV relativeFrom="page">
-                  <wp:posOffset>-271777</wp:posOffset>
-                </wp:positionV>
-                <wp:extent cx="109855" cy="11222990"/>
-                <wp:effectExtent b="0" l="0" r="0" t="0"/>
-                <wp:wrapNone/>
-                <wp:docPr id="2100667902" name="image13.png"/>
-                <a:graphic>
-                  <a:graphicData uri="http://schemas.openxmlformats.org/drawingml/2006/picture">
-                    <pic:pic>
-                      <pic:nvPicPr>
-                        <pic:cNvPr id="0" name="image13.png"/>
-                        <pic:cNvPicPr preferRelativeResize="0"/>
-                      </pic:nvPicPr>
-                      <pic:blipFill>
-                        <a:blip r:embed="rId8"/>
-                        <a:srcRect/>
-                        <a:stretch>
-                          <a:fillRect/>
-                        </a:stretch>
-                      </pic:blipFill>
-                      <pic:spPr>
-                        <a:xfrm>
-                          <a:off x="0" y="0"/>
-                          <a:ext cx="109855" cy="11222990"/>
-                        </a:xfrm>
-                        <a:prstGeom prst="rect"/>
-                        <a:ln/>
-                      </pic:spPr>
-                    </pic:pic>
-                  </a:graphicData>
-                </a:graphic>
-              </wp:anchor>
-            </w:drawing>
+          <mc:Fallback>
+            <w:pict>
+              <v:rect w14:anchorId="6CD26AC4" id="Rectángulo 2100667902" o:spid="_x0000_s1026" style="position:absolute;margin-left:38.2pt;margin-top:-21.4pt;width:8.65pt;height:883.7pt;z-index:251658240;visibility:visible;mso-wrap-style:square;mso-wrap-distance-left:9pt;mso-wrap-distance-top:0;mso-wrap-distance-right:9pt;mso-wrap-distance-bottom:0;mso-position-horizontal:absolute;mso-position-horizontal-relative:page;mso-position-vertical:absolute;mso-position-vertical-relative:page;v-text-anchor:middle" o:gfxdata="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" strokecolor="#31849b">
+                <v:stroke startarrowwidth="narrow" startarrowlength="short" endarrowwidth="narrow" endarrowlength="short"/>
+                <v:textbox inset="2.53958mm,2.53958mm,2.53958mm,2.53958mm">
+                  <w:txbxContent>
+                    <w:p>
+                      <w:pPr>
+                        <w:spacing w:before="0" w:line="240" w:lineRule="auto"/>
+                        <w:ind w:left="0" w:hanging="357"/>
+                        <w:textDirection w:val="btLr"/>
+                      </w:pPr>
+                    </w:p>
+                  </w:txbxContent>
+                </v:textbox>
+                <w10:wrap anchorx="page" anchory="page"/>
+              </v:rect>
+            </w:pict>
           </mc:Fallback>
         </mc:AlternateContent>
       </w:r>
@@ -174,7 +151,7 @@
           <w:color w:val="000000"/>
         </w:rPr>
         <mc:AlternateContent>
-          <mc:Choice Requires="wpg">
+          <mc:Choice Requires="wps">
             <w:drawing>
               <wp:anchor distT="0" distB="0" distL="114300" distR="114300" simplePos="0" relativeHeight="251659264" behindDoc="0" locked="0" layoutInCell="1" hidden="0" allowOverlap="1" wp14:anchorId="1EE4D4A4" wp14:editId="4BBE5013">
                 <wp:simplePos x="0" y="0"/>
@@ -234,47 +211,24 @@
               </wp:anchor>
             </w:drawing>
           </mc:Choice>
-          <mc:Fallback xmlns:cr="http://schemas.microsoft.com/office/comments/2020/reactions" xmlns="http://schemas.microsoft.com/office/tasks/2019/documenttasks" xmlns:dgm="http://schemas.openxmlformats.org/drawingml/2006/diagram" xmlns:lc="http://schemas.openxmlformats.org/drawingml/2006/lockedCanvas" xmlns:c="http://schemas.openxmlformats.org/drawingml/2006/chart" xmlns:pic="http://schemas.openxmlformats.org/drawingml/2006/picture" xmlns:a="http://schemas.openxmlformats.org/drawingml/2006/main" xmlns:sl="http://schemas.openxmlformats.org/schemaLibrary/2006/main">
-            <w:drawing>
-              <wp:anchor allowOverlap="1" behindDoc="0" distB="0" distT="0" distL="114300" distR="114300" hidden="0" layoutInCell="1" locked="0" relativeHeight="0" simplePos="0">
-                <wp:simplePos x="0" y="0"/>
-                <wp:positionH relativeFrom="page">
-                  <wp:posOffset>6965316</wp:posOffset>
-                </wp:positionH>
-                <wp:positionV relativeFrom="page">
-                  <wp:posOffset>-271777</wp:posOffset>
-                </wp:positionV>
-                <wp:extent cx="109855" cy="11222990"/>
-                <wp:effectExtent b="0" l="0" r="0" t="0"/>
-                <wp:wrapNone/>
-                <wp:docPr id="2100667896" name="image7.png"/>
-                <a:graphic>
-                  <a:graphicData uri="http://schemas.openxmlformats.org/drawingml/2006/picture">
-                    <pic:pic>
-                      <pic:nvPicPr>
-                        <pic:cNvPr id="0" name="image7.png"/>
-                        <pic:cNvPicPr preferRelativeResize="0"/>
-                      </pic:nvPicPr>
-                      <pic:blipFill>
-                        <a:blip r:embed="rId8"/>
-                        <a:srcRect/>
-                        <a:stretch>
-                          <a:fillRect/>
-                        </a:stretch>
-                      </pic:blipFill>
-                      <pic:spPr>
-                        <a:xfrm>
-                          <a:off x="0" y="0"/>
-                          <a:ext cx="109855" cy="11222990"/>
-                        </a:xfrm>
-                        <a:prstGeom prst="rect"/>
-                        <a:ln/>
-                      </pic:spPr>
-                    </pic:pic>
-                  </a:graphicData>
-                </a:graphic>
-              </wp:anchor>
-            </w:drawing>
+          <mc:Fallback>
+            <w:pict>
+              <v:rect w14:anchorId="1EE4D4A4" id="Rectángulo 2100667896" o:spid="_x0000_s1027" style="position:absolute;margin-left:548.45pt;margin-top:-21.4pt;width:8.65pt;height:883.7pt;z-index:251659264;visibility:visible;mso-wrap-style:square;mso-wrap-distance-left:9pt;mso-wrap-distance-top:0;mso-wrap-distance-right:9pt;mso-wrap-distance-bottom:0;mso-position-horizontal:absolute;mso-position-horizontal-relative:page;mso-position-vertical:absolute;mso-position-vertical-relative:page;v-text-anchor:middle" o:gfxdata="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" strokecolor="#31849b">
+                <v:stroke startarrowwidth="narrow" startarrowlength="short" endarrowwidth="narrow" endarrowlength="short"/>
+                <v:textbox inset="2.53958mm,2.53958mm,2.53958mm,2.53958mm">
+                  <w:txbxContent>
+                    <w:p>
+                      <w:pPr>
+                        <w:spacing w:before="0" w:line="240" w:lineRule="auto"/>
+                        <w:ind w:left="0" w:hanging="357"/>
+                        <w:textDirection w:val="btLr"/>
+                      </w:pPr>
+                    </w:p>
+                  </w:txbxContent>
+                </v:textbox>
+                <w10:wrap anchorx="page" anchory="page"/>
+              </v:rect>
+            </w:pict>
           </mc:Fallback>
         </mc:AlternateContent>
       </w:r>
@@ -284,9 +238,9 @@
           <w:color w:val="000000"/>
         </w:rPr>
         <mc:AlternateContent>
-          <mc:Choice Requires="wpg">
+          <mc:Choice Requires="wps">
             <w:drawing>
-              <wp:anchor distT="0" distB="0" distL="114300" distR="114300" simplePos="0" relativeHeight="251660288" behindDoc="0" locked="0" layoutInCell="1" hidden="0" allowOverlap="1" wp14:anchorId="5F12C117" wp14:editId="6D86878A">
+              <wp:anchor distT="0" distB="0" distL="114300" distR="114300" simplePos="0" relativeHeight="251660288" behindDoc="0" locked="0" layoutInCell="1" hidden="0" allowOverlap="1" wp14:anchorId="5F12C117" wp14:editId="2FB9927C">
                 <wp:simplePos x="0" y="0"/>
                 <wp:positionH relativeFrom="page">
                   <wp:posOffset>-196213</wp:posOffset>
@@ -295,7 +249,7 @@
                   <wp:posOffset>-7618</wp:posOffset>
                 </wp:positionV>
                 <wp:extent cx="7947660" cy="884555"/>
-                <wp:effectExtent l="0" t="0" r="0" b="0"/>
+                <wp:effectExtent l="0" t="0" r="15240" b="10795"/>
                 <wp:wrapNone/>
                 <wp:docPr id="2100667905" name="Rectángulo 2100667905"/>
                 <wp:cNvGraphicFramePr/>
@@ -316,7 +270,7 @@
                         </a:solidFill>
                         <a:ln w="12700" cap="flat" cmpd="sng">
                           <a:solidFill>
-                            <a:schemeClr val="accent5"/>
+                            <a:srgbClr val="00B0F0"/>
                           </a:solidFill>
                           <a:prstDash val="solid"/>
                           <a:miter lim="800000"/>
@@ -344,47 +298,24 @@
               </wp:anchor>
             </w:drawing>
           </mc:Choice>
-          <mc:Fallback xmlns:cr="http://schemas.microsoft.com/office/comments/2020/reactions" xmlns="http://schemas.microsoft.com/office/tasks/2019/documenttasks" xmlns:dgm="http://schemas.openxmlformats.org/drawingml/2006/diagram" xmlns:lc="http://schemas.openxmlformats.org/drawingml/2006/lockedCanvas" xmlns:c="http://schemas.openxmlformats.org/drawingml/2006/chart" xmlns:pic="http://schemas.openxmlformats.org/drawingml/2006/picture" xmlns:a="http://schemas.openxmlformats.org/drawingml/2006/main" xmlns:sl="http://schemas.openxmlformats.org/schemaLibrary/2006/main">
-            <w:drawing>
-              <wp:anchor allowOverlap="1" behindDoc="0" distB="0" distT="0" distL="114300" distR="114300" hidden="0" layoutInCell="1" locked="0" relativeHeight="0" simplePos="0">
-                <wp:simplePos x="0" y="0"/>
-                <wp:positionH relativeFrom="page">
-                  <wp:posOffset>-196213</wp:posOffset>
-                </wp:positionH>
-                <wp:positionV relativeFrom="page">
-                  <wp:posOffset>-7618</wp:posOffset>
-                </wp:positionV>
-                <wp:extent cx="7947660" cy="884555"/>
-                <wp:effectExtent b="0" l="0" r="0" t="0"/>
-                <wp:wrapNone/>
-                <wp:docPr id="2100667905" name="image16.png"/>
-                <a:graphic>
-                  <a:graphicData uri="http://schemas.openxmlformats.org/drawingml/2006/picture">
-                    <pic:pic>
-                      <pic:nvPicPr>
-                        <pic:cNvPr id="0" name="image16.png"/>
-                        <pic:cNvPicPr preferRelativeResize="0"/>
-                      </pic:nvPicPr>
-                      <pic:blipFill>
-                        <a:blip r:embed="rId8"/>
-                        <a:srcRect/>
-                        <a:stretch>
-                          <a:fillRect/>
-                        </a:stretch>
-                      </pic:blipFill>
-                      <pic:spPr>
-                        <a:xfrm>
-                          <a:off x="0" y="0"/>
-                          <a:ext cx="7947660" cy="884555"/>
-                        </a:xfrm>
-                        <a:prstGeom prst="rect"/>
-                        <a:ln/>
-                      </pic:spPr>
-                    </pic:pic>
-                  </a:graphicData>
-                </a:graphic>
-              </wp:anchor>
-            </w:drawing>
+          <mc:Fallback>
+            <w:pict>
+              <v:rect w14:anchorId="5F12C117" id="Rectángulo 2100667905" o:spid="_x0000_s1028" style="position:absolute;margin-left:-15.45pt;margin-top:-.6pt;width:625.8pt;height:69.65pt;z-index:251660288;visibility:visible;mso-wrap-style:square;mso-wrap-distance-left:9pt;mso-wrap-distance-top:0;mso-wrap-distance-right:9pt;mso-wrap-distance-bottom:0;mso-position-horizontal:absolute;mso-position-horizontal-relative:page;mso-position-vertical:absolute;mso-position-vertical-relative:page;v-text-anchor:middle" o:gfxdata="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" fillcolor="#45acf1" strokecolor="#00b0f0" strokeweight="1pt">
+                <v:stroke startarrowwidth="narrow" startarrowlength="short" endarrowwidth="narrow" endarrowlength="short"/>
+                <v:textbox inset="2.53958mm,2.53958mm,2.53958mm,2.53958mm">
+                  <w:txbxContent>
+                    <w:p>
+                      <w:pPr>
+                        <w:spacing w:before="0" w:line="240" w:lineRule="auto"/>
+                        <w:ind w:left="0" w:hanging="357"/>
+                        <w:textDirection w:val="btLr"/>
+                      </w:pPr>
+                    </w:p>
+                  </w:txbxContent>
+                </v:textbox>
+                <w10:wrap anchorx="page" anchory="page"/>
+              </v:rect>
+            </w:pict>
           </mc:Fallback>
         </mc:AlternateContent>
       </w:r>
@@ -592,8 +523,18 @@
           <w:sz w:val="24"/>
           <w:szCs w:val="24"/>
         </w:rPr>
-        <w:t>ALVAREZ, Abril</w:t>
-      </w:r>
+        <w:t xml:space="preserve">ALVAREZ, </w:t>
+      </w:r>
+      <w:proofErr w:type="gramStart"/>
+      <w:r>
+        <w:rPr>
+          <w:color w:val="000000"/>
+          <w:sz w:val="24"/>
+          <w:szCs w:val="24"/>
+        </w:rPr>
+        <w:t>Abril</w:t>
+      </w:r>
+      <w:proofErr w:type="gramEnd"/>
     </w:p>
     <w:p>
       <w:pPr>
@@ -700,7 +641,7 @@
           <w:color w:val="000000"/>
         </w:rPr>
         <mc:AlternateContent>
-          <mc:Choice Requires="wpg">
+          <mc:Choice Requires="wps">
             <w:drawing>
               <wp:anchor distT="0" distB="0" distL="114300" distR="114300" simplePos="0" relativeHeight="251661312" behindDoc="0" locked="0" layoutInCell="1" hidden="0" allowOverlap="1" wp14:anchorId="5D0AA075" wp14:editId="7BBA94EC">
                 <wp:simplePos x="0" y="0"/>
@@ -760,47 +701,24 @@
               </wp:anchor>
             </w:drawing>
           </mc:Choice>
-          <mc:Fallback xmlns:cr="http://schemas.microsoft.com/office/comments/2020/reactions" xmlns="http://schemas.microsoft.com/office/tasks/2019/documenttasks" xmlns:dgm="http://schemas.openxmlformats.org/drawingml/2006/diagram" xmlns:lc="http://schemas.openxmlformats.org/drawingml/2006/lockedCanvas" xmlns:c="http://schemas.openxmlformats.org/drawingml/2006/chart" xmlns:pic="http://schemas.openxmlformats.org/drawingml/2006/picture" xmlns:a="http://schemas.openxmlformats.org/drawingml/2006/main" xmlns:sl="http://schemas.openxmlformats.org/schemaLibrary/2006/main">
-            <w:drawing>
-              <wp:anchor allowOverlap="1" behindDoc="0" distB="0" distT="0" distL="114300" distR="114300" hidden="0" layoutInCell="1" locked="0" relativeHeight="0" simplePos="0">
-                <wp:simplePos x="0" y="0"/>
-                <wp:positionH relativeFrom="page">
-                  <wp:posOffset>-203197</wp:posOffset>
-                </wp:positionH>
-                <wp:positionV relativeFrom="page">
-                  <wp:posOffset>10022840</wp:posOffset>
-                </wp:positionV>
-                <wp:extent cx="7947660" cy="664210"/>
-                <wp:effectExtent b="0" l="0" r="0" t="0"/>
-                <wp:wrapNone/>
-                <wp:docPr id="2100667903" name="image14.png"/>
-                <a:graphic>
-                  <a:graphicData uri="http://schemas.openxmlformats.org/drawingml/2006/picture">
-                    <pic:pic>
-                      <pic:nvPicPr>
-                        <pic:cNvPr id="0" name="image14.png"/>
-                        <pic:cNvPicPr preferRelativeResize="0"/>
-                      </pic:nvPicPr>
-                      <pic:blipFill>
-                        <a:blip r:embed="rId8"/>
-                        <a:srcRect/>
-                        <a:stretch>
-                          <a:fillRect/>
-                        </a:stretch>
-                      </pic:blipFill>
-                      <pic:spPr>
-                        <a:xfrm>
-                          <a:off x="0" y="0"/>
-                          <a:ext cx="7947660" cy="664210"/>
-                        </a:xfrm>
-                        <a:prstGeom prst="rect"/>
-                        <a:ln/>
-                      </pic:spPr>
-                    </pic:pic>
-                  </a:graphicData>
-                </a:graphic>
-              </wp:anchor>
-            </w:drawing>
+          <mc:Fallback>
+            <w:pict>
+              <v:rect w14:anchorId="5D0AA075" id="Rectángulo 2100667903" o:spid="_x0000_s1029" style="position:absolute;left:0;text-align:left;margin-left:-16pt;margin-top:789.2pt;width:625.8pt;height:52.3pt;z-index:251661312;visibility:visible;mso-wrap-style:square;mso-wrap-distance-left:9pt;mso-wrap-distance-top:0;mso-wrap-distance-right:9pt;mso-wrap-distance-bottom:0;mso-position-horizontal:absolute;mso-position-horizontal-relative:page;mso-position-vertical:absolute;mso-position-vertical-relative:page;v-text-anchor:middle" o:gfxdata="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" fillcolor="#45acf1" strokecolor="#45acf1" strokeweight="1pt">
+                <v:stroke startarrowwidth="narrow" startarrowlength="short" endarrowwidth="narrow" endarrowlength="short"/>
+                <v:textbox inset="2.53958mm,2.53958mm,2.53958mm,2.53958mm">
+                  <w:txbxContent>
+                    <w:p>
+                      <w:pPr>
+                        <w:spacing w:before="0" w:line="240" w:lineRule="auto"/>
+                        <w:ind w:left="0" w:hanging="357"/>
+                        <w:textDirection w:val="btLr"/>
+                      </w:pPr>
+                    </w:p>
+                  </w:txbxContent>
+                </v:textbox>
+                <w10:wrap anchorx="page" anchory="page"/>
+              </v:rect>
+            </w:pict>
           </mc:Fallback>
         </mc:AlternateContent>
       </w:r>
@@ -833,7 +751,7 @@
                     <pic:cNvPicPr preferRelativeResize="0"/>
                   </pic:nvPicPr>
                   <pic:blipFill>
-                    <a:blip r:embed="rId9"/>
+                    <a:blip r:embed="rId8"/>
                     <a:srcRect/>
                     <a:stretch>
                       <a:fillRect/>
@@ -881,7 +799,7 @@
                     <pic:cNvPicPr preferRelativeResize="0"/>
                   </pic:nvPicPr>
                   <pic:blipFill>
-                    <a:blip r:embed="rId10"/>
+                    <a:blip r:embed="rId9"/>
                     <a:srcRect/>
                     <a:stretch>
                       <a:fillRect/>
@@ -999,7 +917,7 @@
           </mc:Choice>
           <mc:Fallback>
             <w:pict>
-              <v:rect w14:anchorId="7A3E716A" id="Rectángulo 2100667898" o:spid="_x0000_s1030" style="position:absolute;left:0;text-align:left;margin-left:144.15pt;margin-top:-13.15pt;width:195.35pt;height:693.6pt;z-index:251664384;visibility:visible;mso-wrap-style:square;mso-width-percent:0;mso-height-percent:0;mso-wrap-distance-left:9pt;mso-wrap-distance-top:0;mso-wrap-distance-right:9pt;mso-wrap-distance-bottom:0;mso-position-horizontal:right;mso-position-horizontal-relative:page;mso-position-vertical:absolute;mso-position-vertical-relative:margin;mso-width-percent:0;mso-height-percent:0;mso-width-relative:margin;mso-height-relative:margin;v-text-anchor:middle" o:gfxdata="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" fillcolor="#45acf1" strokecolor="#45acf1">
+              <v:rect w14:anchorId="7A3E716A" id="Rectángulo 2100667898" o:spid="_x0000_s1030" style="position:absolute;left:0;text-align:left;margin-left:144.15pt;margin-top:-13.15pt;width:195.35pt;height:693.6pt;z-index:251664384;visibility:visible;mso-wrap-style:square;mso-width-percent:0;mso-height-percent:0;mso-wrap-distance-left:9pt;mso-wrap-distance-top:0;mso-wrap-distance-right:9pt;mso-wrap-distance-bottom:0;mso-position-horizontal:right;mso-position-horizontal-relative:page;mso-position-vertical:absolute;mso-position-vertical-relative:margin;mso-width-percent:0;mso-height-percent:0;mso-width-relative:margin;mso-height-relative:margin;v-text-anchor:middle" o:gfxdata="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" fillcolor="#45acf1" strokecolor="#45acf1">
                 <v:stroke startarrowwidth="narrow" startarrowlength="short" endarrowwidth="narrow" endarrowlength="short"/>
                 <v:textbox inset="2.53958mm,2.53958mm,2.53958mm,2.53958mm">
                   <w:txbxContent>
@@ -1025,7 +943,7 @@
           <w:color w:val="000000"/>
         </w:rPr>
         <mc:AlternateContent>
-          <mc:Choice Requires="wpg">
+          <mc:Choice Requires="wps">
             <w:drawing>
               <wp:anchor distT="0" distB="0" distL="114300" distR="114300" simplePos="0" relativeHeight="251665408" behindDoc="0" locked="0" layoutInCell="1" hidden="0" allowOverlap="1" wp14:anchorId="210AB1DA" wp14:editId="3255AA8C">
                 <wp:simplePos x="0" y="0"/>
@@ -1079,7 +997,21 @@
                                 <w:rFonts w:ascii="Arial" w:eastAsia="Arial" w:hAnsi="Arial" w:cs="Arial"/>
                                 <w:color w:val="000000"/>
                               </w:rPr>
-                              <w:t xml:space="preserve">  En el Plan de Gestión de Riesgos se describen detalladamente los distintos pasos a seguir para la gestión integral de los riesgos detectados durante todo el proyecto. </w:t>
+                              <w:t xml:space="preserve">  </w:t>
+                            </w:r>
+                            <w:r>
+                              <w:rPr>
+                                <w:rFonts w:ascii="Arial" w:eastAsia="Arial" w:hAnsi="Arial" w:cs="Arial"/>
+                                <w:color w:val="000000"/>
+                              </w:rPr>
+                              <w:t xml:space="preserve">    </w:t>
+                            </w:r>
+                            <w:r>
+                              <w:rPr>
+                                <w:rFonts w:eastAsia="Arial"/>
+                                <w:color w:val="000000"/>
+                              </w:rPr>
+                              <w:t xml:space="preserve">En el Plan de Gestión de Riesgos se describen detalladamente los distintos pasos a seguir para la gestión integral de los riesgos detectados durante todo el proyecto. </w:t>
                             </w:r>
                           </w:p>
                           <w:p>
@@ -1091,10 +1023,31 @@
                             </w:pPr>
                             <w:r>
                               <w:rPr>
-                                <w:rFonts w:ascii="Arial" w:eastAsia="Arial" w:hAnsi="Arial" w:cs="Arial"/>
+                                <w:rFonts w:eastAsia="Arial"/>
                                 <w:color w:val="000000"/>
                               </w:rPr>
-                              <w:t xml:space="preserve">  En este se definen roles y responsabilidades para la gestión de los distintos riesgos, como así también la metodología de trabajo para gestionar los mismos, dicha metodología es única para cada proyecto.</w:t>
+                              <w:t xml:space="preserve">  </w:t>
+                            </w:r>
+                            <w:r>
+                              <w:rPr>
+                                <w:rFonts w:eastAsia="Arial"/>
+                                <w:color w:val="000000"/>
+                              </w:rPr>
+                              <w:t xml:space="preserve">     </w:t>
+                            </w:r>
+                            <w:r>
+                              <w:rPr>
+                                <w:rFonts w:eastAsia="Arial"/>
+                                <w:color w:val="000000"/>
+                              </w:rPr>
+                              <w:t>En este se definen roles y responsabilidades para la gestión de los distintos riesgo</w:t>
+                            </w:r>
+                            <w:r>
+                              <w:rPr>
+                                <w:rFonts w:eastAsia="Arial"/>
+                                <w:color w:val="000000"/>
+                              </w:rPr>
+                              <w:t>s, como así también la metodología de trabajo para gestionar los mismos, dicha metodología es única para cada proyecto.</w:t>
                             </w:r>
                           </w:p>
                           <w:p>
@@ -1122,47 +1075,96 @@
               </wp:anchor>
             </w:drawing>
           </mc:Choice>
-          <mc:Fallback xmlns:cr="http://schemas.microsoft.com/office/comments/2020/reactions" xmlns="http://schemas.microsoft.com/office/tasks/2019/documenttasks" xmlns:dgm="http://schemas.openxmlformats.org/drawingml/2006/diagram" xmlns:lc="http://schemas.openxmlformats.org/drawingml/2006/lockedCanvas" xmlns:c="http://schemas.openxmlformats.org/drawingml/2006/chart" xmlns:pic="http://schemas.openxmlformats.org/drawingml/2006/picture" xmlns:a="http://schemas.openxmlformats.org/drawingml/2006/main" xmlns:sl="http://schemas.openxmlformats.org/schemaLibrary/2006/main">
-            <w:drawing>
-              <wp:anchor allowOverlap="1" behindDoc="0" distB="0" distT="0" distL="114300" distR="114300" hidden="0" layoutInCell="1" locked="0" relativeHeight="0" simplePos="0">
-                <wp:simplePos x="0" y="0"/>
-                <wp:positionH relativeFrom="margin">
-                  <wp:posOffset>3568066</wp:posOffset>
-                </wp:positionH>
-                <wp:positionV relativeFrom="margin">
-                  <wp:posOffset>57786</wp:posOffset>
-                </wp:positionV>
-                <wp:extent cx="2066925" cy="7353300"/>
-                <wp:effectExtent b="0" l="0" r="0" t="0"/>
-                <wp:wrapSquare wrapText="bothSides" distB="0" distT="0" distL="114300" distR="114300"/>
-                <wp:docPr id="2100667899" name="image10.png"/>
-                <a:graphic>
-                  <a:graphicData uri="http://schemas.openxmlformats.org/drawingml/2006/picture">
-                    <pic:pic>
-                      <pic:nvPicPr>
-                        <pic:cNvPr id="0" name="image10.png"/>
-                        <pic:cNvPicPr preferRelativeResize="0"/>
-                      </pic:nvPicPr>
-                      <pic:blipFill>
-                        <a:blip r:embed="rId8"/>
-                        <a:srcRect/>
-                        <a:stretch>
-                          <a:fillRect/>
-                        </a:stretch>
-                      </pic:blipFill>
-                      <pic:spPr>
-                        <a:xfrm>
-                          <a:off x="0" y="0"/>
-                          <a:ext cx="2066925" cy="7353300"/>
-                        </a:xfrm>
-                        <a:prstGeom prst="rect"/>
-                        <a:ln/>
-                      </pic:spPr>
-                    </pic:pic>
-                  </a:graphicData>
-                </a:graphic>
-              </wp:anchor>
-            </w:drawing>
+          <mc:Fallback>
+            <w:pict>
+              <v:rect w14:anchorId="210AB1DA" id="Rectángulo 2100667899" o:spid="_x0000_s1031" style="position:absolute;left:0;text-align:left;margin-left:280.95pt;margin-top:4.55pt;width:162.75pt;height:579pt;z-index:251665408;visibility:visible;mso-wrap-style:square;mso-wrap-distance-left:9pt;mso-wrap-distance-top:0;mso-wrap-distance-right:9pt;mso-wrap-distance-bottom:0;mso-position-horizontal:absolute;mso-position-horizontal-relative:margin;mso-position-vertical:absolute;mso-position-vertical-relative:margin;v-text-anchor:top" o:gfxdata="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" strokecolor="#31849b">
+                <v:stroke startarrowwidth="narrow" startarrowlength="short" endarrowwidth="narrow" endarrowlength="short"/>
+                <v:textbox inset="2.53958mm,1.2694mm,2.53958mm,1.2694mm">
+                  <w:txbxContent>
+                    <w:p>
+                      <w:pPr>
+                        <w:spacing w:line="274" w:lineRule="auto"/>
+                        <w:ind w:left="0" w:hanging="357"/>
+                        <w:jc w:val="both"/>
+                        <w:textDirection w:val="btLr"/>
+                      </w:pPr>
+                      <w:r>
+                        <w:rPr>
+                          <w:rFonts w:ascii="Arial" w:eastAsia="Arial" w:hAnsi="Arial" w:cs="Arial"/>
+                          <w:color w:val="000000"/>
+                        </w:rPr>
+                        <w:t xml:space="preserve">  </w:t>
+                      </w:r>
+                      <w:r>
+                        <w:rPr>
+                          <w:rFonts w:ascii="Arial" w:eastAsia="Arial" w:hAnsi="Arial" w:cs="Arial"/>
+                          <w:color w:val="000000"/>
+                        </w:rPr>
+                        <w:t xml:space="preserve">    </w:t>
+                      </w:r>
+                      <w:r>
+                        <w:rPr>
+                          <w:rFonts w:eastAsia="Arial"/>
+                          <w:color w:val="000000"/>
+                        </w:rPr>
+                        <w:t xml:space="preserve">En el Plan de Gestión de Riesgos se describen detalladamente los distintos pasos a seguir para la gestión integral de los riesgos detectados durante todo el proyecto. </w:t>
+                      </w:r>
+                    </w:p>
+                    <w:p>
+                      <w:pPr>
+                        <w:spacing w:line="274" w:lineRule="auto"/>
+                        <w:ind w:left="0" w:hanging="357"/>
+                        <w:jc w:val="both"/>
+                        <w:textDirection w:val="btLr"/>
+                      </w:pPr>
+                      <w:r>
+                        <w:rPr>
+                          <w:rFonts w:eastAsia="Arial"/>
+                          <w:color w:val="000000"/>
+                        </w:rPr>
+                        <w:t xml:space="preserve">  </w:t>
+                      </w:r>
+                      <w:r>
+                        <w:rPr>
+                          <w:rFonts w:eastAsia="Arial"/>
+                          <w:color w:val="000000"/>
+                        </w:rPr>
+                        <w:t xml:space="preserve">     </w:t>
+                      </w:r>
+                      <w:r>
+                        <w:rPr>
+                          <w:rFonts w:eastAsia="Arial"/>
+                          <w:color w:val="000000"/>
+                        </w:rPr>
+                        <w:t>En este se definen roles y responsabilidades para la gestión de los distintos riesgo</w:t>
+                      </w:r>
+                      <w:r>
+                        <w:rPr>
+                          <w:rFonts w:eastAsia="Arial"/>
+                          <w:color w:val="000000"/>
+                        </w:rPr>
+                        <w:t>s, como así también la metodología de trabajo para gestionar los mismos, dicha metodología es única para cada proyecto.</w:t>
+                      </w:r>
+                    </w:p>
+                    <w:p>
+                      <w:pPr>
+                        <w:spacing w:line="275" w:lineRule="auto"/>
+                        <w:ind w:left="0" w:hanging="357"/>
+                        <w:jc w:val="both"/>
+                        <w:textDirection w:val="btLr"/>
+                      </w:pPr>
+                    </w:p>
+                    <w:p>
+                      <w:pPr>
+                        <w:spacing w:line="275" w:lineRule="auto"/>
+                        <w:textDirection w:val="btLr"/>
+                      </w:pPr>
+                    </w:p>
+                  </w:txbxContent>
+                </v:textbox>
+                <w10:wrap type="square" anchorx="margin" anchory="margin"/>
+              </v:rect>
+            </w:pict>
           </mc:Fallback>
         </mc:AlternateContent>
       </w:r>
@@ -1290,6 +1292,7 @@
           <w:docPartUnique/>
         </w:docPartObj>
       </w:sdtPr>
+      <w:sdtEndPr/>
       <w:sdtContent>
         <w:p>
           <w:pPr>
@@ -1584,6 +1587,13 @@
                 <w:color w:val="000000"/>
               </w:rPr>
               <w:tab/>
+            </w:r>
+            <w:r>
+              <w:rPr>
+                <w:rFonts w:ascii="Cambria" w:eastAsia="Cambria" w:hAnsi="Cambria" w:cs="Cambria"/>
+                <w:b/>
+                <w:color w:val="000000"/>
+              </w:rPr>
               <w:t>6</w:t>
             </w:r>
           </w:hyperlink>
@@ -1702,7 +1712,15 @@
                 <w:b/>
                 <w:color w:val="000000"/>
               </w:rPr>
-              <w:t>Seguimiento de Riesgos</w:t>
+              <w:t>Seg</w:t>
+            </w:r>
+            <w:r>
+              <w:rPr>
+                <w:rFonts w:ascii="Cambria" w:eastAsia="Cambria" w:hAnsi="Cambria" w:cs="Cambria"/>
+                <w:b/>
+                <w:color w:val="000000"/>
+              </w:rPr>
+              <w:t>uimiento de Riesgos</w:t>
             </w:r>
             <w:r>
               <w:rPr>
@@ -2013,7 +2031,10 @@
         <w:jc w:val="both"/>
       </w:pPr>
       <w:r>
-        <w:t xml:space="preserve">Dado que el equipo de desarrollo está conformado por un grupo reducido, todos los integrantes participaremos activamente en las distintas etapas de la gestión de riesgos: </w:t>
+        <w:t>Dado que el equipo de desarrollo está confor</w:t>
+      </w:r>
+      <w:r>
+        <w:t xml:space="preserve">mado por un grupo reducido, todos los integrantes participaremos activamente en las distintas etapas de la gestión de riesgos: </w:t>
       </w:r>
     </w:p>
     <w:p>
@@ -2051,7 +2072,10 @@
         <w:jc w:val="both"/>
       </w:pPr>
       <w:r>
-        <w:t>Seguimiento: todos realizarán el control de riesgos durante el avance del proyecto, ajustando acciones si es necesario.</w:t>
+        <w:t>Seguimiento: todos realizarán e</w:t>
+      </w:r>
+      <w:r>
+        <w:t>l control de riesgos durante el avance del proyecto, ajustando acciones si es necesario.</w:t>
       </w:r>
     </w:p>
     <w:p>
@@ -2090,7 +2114,10 @@
         <w:jc w:val="both"/>
       </w:pPr>
       <w:r>
-        <w:t xml:space="preserve">Identificación: en cada iteración, se registrarán los riesgos detectados directamente en la aplicación Vesta </w:t>
+        <w:t>Identificación: en cada iteración, se regis</w:t>
+      </w:r>
+      <w:r>
+        <w:t xml:space="preserve">trarán los riesgos detectados directamente en la aplicación Vesta </w:t>
       </w:r>
       <w:proofErr w:type="spellStart"/>
       <w:r>
@@ -2111,7 +2138,10 @@
         <w:jc w:val="both"/>
       </w:pPr>
       <w:r>
-        <w:t>Análisis: La herramienta permitirá asignar valores de probabilidad (0%–100%) e impacto (1–10), calculando automáticamente el factor de riesgo. A partir de esa evaluación, se priorizan los riesgos más relevantes y, en caso de ser necesario, se definen planes de acción.</w:t>
+        <w:t>Análisis: La herramienta permitirá asignar valores de probabilidad (0%–100%) e impacto (1–10), calculando automáticamente el factor de riesgo. A partir de esa evaluación, se p</w:t>
+      </w:r>
+      <w:r>
+        <w:t>riorizan los riesgos más relevantes y, en caso de ser necesario, se definen planes de acción.</w:t>
       </w:r>
     </w:p>
     <w:p>
@@ -2124,7 +2154,10 @@
         <w:jc w:val="both"/>
       </w:pPr>
       <w:r>
-        <w:t>Seguimiento: durante todo el proyecto se controlarán los riesgos con planes definidos en la aplicación y se reevalúan en las siguientes iteraciones para verificar su evolución.</w:t>
+        <w:t>Seguimiento: durante todo el proyecto se controlarán los riesgos con planes definidos en la aplicación y se reevalúan en las siguientes iteraciones para verificar</w:t>
+      </w:r>
+      <w:r>
+        <w:t xml:space="preserve"> su evolución.</w:t>
       </w:r>
     </w:p>
     <w:p>
@@ -2211,7 +2244,10 @@
       <w:bookmarkStart w:id="8" w:name="_heading=h.vccx4oe4wnpf" w:colFirst="0" w:colLast="0"/>
       <w:bookmarkEnd w:id="8"/>
       <w:r>
-        <w:t>Aplicación utilizada</w:t>
+        <w:t>Aplicación u</w:t>
+      </w:r>
+      <w:r>
+        <w:t>tilizada</w:t>
       </w:r>
     </w:p>
     <w:p>
@@ -2258,7 +2294,10 @@
       </w:r>
       <w:proofErr w:type="spellEnd"/>
       <w:r>
-        <w:t xml:space="preserve"> en el botón de ‘nuevo riesgo’ en la lista de riesgos se mostrará el formulario de identificación de riesgos donde cargaremos cada riesgo detectado dentro de las categorías definidas:</w:t>
+        <w:t xml:space="preserve"> en el botón de ‘nuevo riesgo’ en la lista de riesgos se mostrará el formula</w:t>
+      </w:r>
+      <w:r>
+        <w:t>rio de identificación de riesgos donde cargaremos cada riesgo detectado dentro de las categorías definidas:</w:t>
       </w:r>
     </w:p>
     <w:p>
@@ -2417,7 +2456,10 @@
       <w:bookmarkStart w:id="13" w:name="_heading=h.so41r0syoijf" w:colFirst="0" w:colLast="0"/>
       <w:bookmarkEnd w:id="13"/>
       <w:r>
-        <w:t>Cada integrante del equipo podrá registrar los riesgos detectados a través del formulario de carga, rellenando los campos con la descripción del riesgo, la categoría y los responsables. La descripción de los riesgos se realizará siguiendo la notación “Dadas &lt;causas&gt;, podría ocurrir &lt;riesgo&gt;, lo que conduciría a &lt;efectos&gt;”, lo que permite mantener un criterio uniforme en la redacción.</w:t>
+        <w:t xml:space="preserve">Cada integrante del equipo podrá registrar los riesgos detectados a través del formulario de carga, rellenando los campos con la descripción del riesgo, la categoría y los </w:t>
+      </w:r>
+      <w:r>
+        <w:t>responsables. La descripción de los riesgos se realizará siguiendo la notación “Dadas &lt;causas&gt;, podría ocurrir &lt;riesgo&gt;, lo que conduciría a &lt;efectos&gt;”, lo que permite mantener un criterio uniforme en la redacción.</w:t>
       </w:r>
     </w:p>
     <w:p>
@@ -2428,7 +2470,13 @@
       <w:bookmarkStart w:id="14" w:name="_heading=h.6lpxiylk5dh" w:colFirst="0" w:colLast="0"/>
       <w:bookmarkEnd w:id="14"/>
       <w:r>
-        <w:t>En esta etapa no se asignan aún valores de probabilidad ni de impacto, el objetivo principal es identificar y organizar los riesgos de manera sistemática, garantizando que se contemplen distintas perspectivas del proyecto. Una vez concluido este registro inicial, los riesgos quedan disponibles en la aplicación para ser evaluados en mayor detalle durante la fase de Análisis.</w:t>
+        <w:t>En esta etapa no se asignan aún valores d</w:t>
+      </w:r>
+      <w:r>
+        <w:t>e probabilidad ni de impacto, el objetivo principal es identificar y organizar los riesgos de manera sistemática, garantizando que se contemplen distintas perspectivas del proyecto. Una vez concluido este registro inicial, los riesgos quedan disponibles en</w:t>
+      </w:r>
+      <w:r>
+        <w:t xml:space="preserve"> la aplicación para ser evaluados en mayor detalle durante la fase de Análisis.</w:t>
       </w:r>
     </w:p>
     <w:p>
@@ -2469,7 +2517,10 @@
         <w:jc w:val="both"/>
       </w:pPr>
       <w:r>
-        <w:t>La etapa de Análisis de Riesgos se efectuará una vez concluida la etapa previa, “Identificación y Evaluación de Riesgos”, al inicio de cada iteración o fase del proyecto según corresponda.</w:t>
+        <w:t>La etapa de Análisis de Riesgos se efectuará una vez concluida la etapa previa, “Identificación y Evaluación de Riesgos”, al inicio de cad</w:t>
+      </w:r>
+      <w:r>
+        <w:t>a iteración o fase del proyecto según corresponda.</w:t>
       </w:r>
     </w:p>
     <w:p>
@@ -2496,15 +2547,13 @@
         <w:jc w:val="both"/>
       </w:pPr>
       <w:r>
-        <w:t xml:space="preserve">En la tarea de Análisis se trabajará con la aplicación </w:t>
-      </w:r>
-      <w:proofErr w:type="spellStart"/>
-      <w:r>
-        <w:t>Veska</w:t>
-      </w:r>
-      <w:proofErr w:type="spellEnd"/>
-      <w:r>
-        <w:t xml:space="preserve"> </w:t>
+        <w:t>En la tarea de Análisis se trabajará con la aplicación Ves</w:t>
+      </w:r>
+      <w:r>
+        <w:t>t</w:t>
+      </w:r>
+      <w:r>
+        <w:t xml:space="preserve">a </w:t>
       </w:r>
       <w:proofErr w:type="spellStart"/>
       <w:r>
@@ -2539,7 +2588,10 @@
         <w:jc w:val="both"/>
       </w:pPr>
       <w:r>
-        <w:t xml:space="preserve">Una vez identificados los riesgos, se habilitará el botón para evaluar cada riesgo, al hacer </w:t>
+        <w:t>Una vez ident</w:t>
+      </w:r>
+      <w:r>
+        <w:t xml:space="preserve">ificados los riesgos, se habilitará el botón para evaluar cada riesgo, al hacer </w:t>
       </w:r>
       <w:proofErr w:type="spellStart"/>
       <w:r>
@@ -2547,7 +2599,10 @@
       </w:r>
       <w:proofErr w:type="spellEnd"/>
       <w:r>
-        <w:t xml:space="preserve"> en este botón, se abrirá el formulario de evaluación de riesgos, en el que se deberá rellenar los campos con el impacto y probabilidad del riesgo, y una justificación del impacto y probabilidad seleccionados. Estos valores son acordados por el equipo en función de la etapa del proyecto y de la información disponible. </w:t>
+        <w:t xml:space="preserve"> en este botón, se abrirá el formulario de evaluación de riesgos, en el que se deberá rellenar los campos con el impacto y probabilidad del riesgo, y una justificación del</w:t>
+      </w:r>
+      <w:r>
+        <w:t xml:space="preserve"> impacto y probabilidad seleccionados. Estos valores son acordados por el equipo en función de la etapa del proyecto y de la información disponible. </w:t>
       </w:r>
     </w:p>
     <w:p>
@@ -2558,7 +2613,10 @@
       <w:bookmarkStart w:id="22" w:name="_heading=h.bfa49gd6byww" w:colFirst="0" w:colLast="0"/>
       <w:bookmarkEnd w:id="22"/>
       <w:r>
-        <w:t xml:space="preserve">Con estos datos, la herramienta calcula automáticamente el Factor de Riesgo (FR) y lo clasifica en diferentes niveles de severidad. Si el factor de riesgo calculado es mayor o igual a 36, se habilitará el botón para planificar el riesgo. Al hacer </w:t>
+        <w:t>Con estos datos, la herramienta calcula automáticamente el Factor de Riesgo (FR) y lo clasifica en diferen</w:t>
+      </w:r>
+      <w:r>
+        <w:t xml:space="preserve">tes niveles de severidad. Si el factor de riesgo calculado es mayor o igual a 36, se habilitará el botón para planificar el riesgo. Al hacer </w:t>
       </w:r>
       <w:proofErr w:type="spellStart"/>
       <w:r>
@@ -2566,7 +2624,10 @@
       </w:r>
       <w:proofErr w:type="spellEnd"/>
       <w:r>
-        <w:t xml:space="preserve"> en este botón, o sobre el escudo del riesgo, se abrirá el formulario de planificación de riesgos, en el que se deberá rellenar los campos con el tipo de plan a ejecutar (minimización, mitigación o de contingencia), una descripción del plan y, al menos, una tarea.</w:t>
+        <w:t xml:space="preserve"> en este botón, o sobre el escudo del riesgo, se abrirá el formulario de planificación de riesgos, en el que s</w:t>
+      </w:r>
+      <w:r>
+        <w:t>e deberá rellenar los campos con el tipo de plan a ejecutar (minimización, mitigación o de contingencia), una descripción del plan y, al menos, una tarea.</w:t>
       </w:r>
     </w:p>
     <w:p>
@@ -2577,7 +2638,10 @@
       <w:bookmarkStart w:id="23" w:name="_heading=h.4d6vshvj5d0s" w:colFirst="0" w:colLast="0"/>
       <w:bookmarkEnd w:id="23"/>
       <w:r>
-        <w:t>De esta forma, los riesgos muy bajos se cierran sin necesidad de acciones adicionales, los riesgos bajos pueden quedar en monitoreo, mientras que los riesgos moderados y críticos requieren obligatoriamente la definición de un plan de acción.</w:t>
+        <w:t>De esta forma, los riesgos muy bajos se cierran sin necesidad de acciones adicionales, los riesgos ba</w:t>
+      </w:r>
+      <w:r>
+        <w:t>jos pueden quedar en monitoreo, mientras que los riesgos moderados y críticos requieren obligatoriamente la definición de un plan de acción.</w:t>
       </w:r>
     </w:p>
     <w:p>
@@ -2654,10 +2718,14 @@
     </w:p>
     <w:p>
       <w:pPr>
-        <w:jc w:val="both"/>
-      </w:pPr>
-      <w:r>
-        <w:t>El seguimiento de riesgos se llevará a cabo durante todo el proyecto.</w:t>
+        <w:ind w:left="0"/>
+        <w:jc w:val="both"/>
+      </w:pPr>
+      <w:r>
+        <w:t xml:space="preserve">El seguimiento de riesgos se llevará a cabo durante todo el </w:t>
+      </w:r>
+      <w:r>
+        <w:t>proyecto.</w:t>
       </w:r>
     </w:p>
     <w:p>
@@ -2683,15 +2751,13 @@
         <w:jc w:val="both"/>
       </w:pPr>
       <w:r>
-        <w:t xml:space="preserve">En esta etapa para generar el informe de seguimiento de riesgos se utiliza la aplicación </w:t>
-      </w:r>
-      <w:proofErr w:type="spellStart"/>
-      <w:r>
-        <w:t>Veska</w:t>
-      </w:r>
-      <w:proofErr w:type="spellEnd"/>
-      <w:r>
-        <w:t xml:space="preserve"> </w:t>
+        <w:t>En esta etapa para generar el informe de seguimiento de riesgos se utiliza la aplicación Ves</w:t>
+      </w:r>
+      <w:r>
+        <w:t>t</w:t>
+      </w:r>
+      <w:r>
+        <w:t xml:space="preserve">a </w:t>
       </w:r>
       <w:proofErr w:type="spellStart"/>
       <w:r>
@@ -2726,32 +2792,42 @@
         <w:jc w:val="both"/>
       </w:pPr>
       <w:r>
-        <w:t xml:space="preserve">El seguimiento de riesgos se realiza utilizando la información registrada durante la etapa de análisis. Una vez que los riesgos han sido evaluados y se han definido sus planes de acción (si corresponde), el Líder de proyecto accede a la sección Monitoreo &gt; Seguimiento de riesgo en </w:t>
+        <w:t>El seguimiento de riesgos se realiza utili</w:t>
+      </w:r>
+      <w:r>
+        <w:t>zando la información registrada durante la etapa de análisis. Una vez que los riesgos han sido evaluados y se han definido sus planes de acción (si corresponde), el Líder de proyecto accede a la sección Monitoreo &gt; Seguimiento de riesgo en Ves</w:t>
+      </w:r>
+      <w:r>
+        <w:t>t</w:t>
+      </w:r>
+      <w:r>
+        <w:t xml:space="preserve">a </w:t>
       </w:r>
       <w:proofErr w:type="spellStart"/>
       <w:r>
-        <w:t>Veska</w:t>
+        <w:t>Risk</w:t>
       </w:r>
       <w:proofErr w:type="spellEnd"/>
       <w:r>
+        <w:t xml:space="preserve"> Manag</w:t>
+      </w:r>
+      <w:r>
+        <w:t>er. Allí se muestra una lista de todos los riesgos del proyecto, incluyendo su Factor de Riesgo (FR), estado y prioridad.</w:t>
+      </w:r>
+    </w:p>
+    <w:p>
+      <w:pPr>
+        <w:ind w:left="0"/>
+        <w:jc w:val="both"/>
+      </w:pPr>
+      <w:r>
+        <w:t>El proceso de seguimiento consiste en revisar periódicamente cada riesgo para verificar su estado actual y comprobar si las acciones p</w:t>
+      </w:r>
+      <w:r>
+        <w:t>lanificadas se están ejecutando correctamente. Una vez que se realiza esta revisión, el Líder de proyecto puede generar un informe seleccionando ‘Generar informe’, que descarga un PDF con un resumen actualizado del estado de todos los riesgos del proyecto.</w:t>
+      </w:r>
+      <w:r>
         <w:t xml:space="preserve"> </w:t>
-      </w:r>
-      <w:proofErr w:type="spellStart"/>
-      <w:r>
-        <w:t>Risk</w:t>
-      </w:r>
-      <w:proofErr w:type="spellEnd"/>
-      <w:r>
-        <w:t xml:space="preserve"> Manager. Allí se muestra una lista de todos los riesgos del proyecto, incluyendo su Factor de Riesgo (FR), estado y prioridad.</w:t>
-      </w:r>
-    </w:p>
-    <w:p>
-      <w:pPr>
-        <w:ind w:left="0"/>
-        <w:jc w:val="both"/>
-      </w:pPr>
-      <w:r>
-        <w:t xml:space="preserve">El proceso de seguimiento consiste en revisar periódicamente cada riesgo para verificar su estado actual y comprobar si las acciones planificadas se están ejecutando correctamente. Una vez que se realiza esta revisión, el Líder de proyecto puede generar un informe seleccionando ‘Generar informe’, que descarga un PDF con un resumen actualizado del estado de todos los riesgos del proyecto. </w:t>
       </w:r>
     </w:p>
     <w:p>
@@ -2839,26 +2915,41 @@
         <w:jc w:val="both"/>
       </w:pPr>
       <w:r>
-        <w:t xml:space="preserve">A continuación se presentan capturas de pantalla correspondientes a la etapa de identificación inicial de riesgos. Estas imágenes muestran cómo se registraron los riesgos en </w:t>
+        <w:t xml:space="preserve">A </w:t>
+      </w:r>
+      <w:r>
+        <w:t>continuación,</w:t>
+      </w:r>
+      <w:r>
+        <w:t xml:space="preserve"> se presentan capturas de pantalla correspondientes a la etapa de identificación inicial de riesgos. Estas imágenes muestran cómo se registraron los riesgos en Ves</w:t>
+      </w:r>
+      <w:r>
+        <w:t>t</w:t>
+      </w:r>
+      <w:r>
+        <w:t>a</w:t>
+      </w:r>
+      <w:bookmarkStart w:id="37" w:name="_GoBack"/>
+      <w:bookmarkEnd w:id="37"/>
+      <w:r>
+        <w:t xml:space="preserve"> </w:t>
       </w:r>
       <w:proofErr w:type="spellStart"/>
       <w:r>
-        <w:t>Veska</w:t>
+        <w:t>Risk</w:t>
       </w:r>
       <w:proofErr w:type="spellEnd"/>
       <w:r>
-        <w:t xml:space="preserve"> </w:t>
-      </w:r>
-      <w:proofErr w:type="spellStart"/>
-      <w:r>
-        <w:t>Risk</w:t>
-      </w:r>
-      <w:proofErr w:type="spellEnd"/>
-      <w:r>
-        <w:t xml:space="preserve"> Manager, incluyendo la descripción de cada riesgo y los responsables del mismo:</w:t>
-      </w:r>
-    </w:p>
-    <w:p>
+        <w:t xml:space="preserve"> Manager, incluyendo la descripción de cada riesgo y los responsables de</w:t>
+      </w:r>
+      <w:r>
+        <w:t>l mismo:</w:t>
+      </w:r>
+    </w:p>
+    <w:p>
+      <w:pPr>
+        <w:ind w:left="0"/>
+      </w:pPr>
       <w:r>
         <w:rPr>
           <w:noProof/>
@@ -2877,7 +2968,7 @@
                     <pic:cNvPicPr preferRelativeResize="0"/>
                   </pic:nvPicPr>
                   <pic:blipFill>
-                    <a:blip r:embed="rId11"/>
+                    <a:blip r:embed="rId10"/>
                     <a:srcRect l="7905" r="19097"/>
                     <a:stretch>
                       <a:fillRect/>
@@ -2903,6 +2994,7 @@
     <w:p>
       <w:pPr>
         <w:spacing w:before="0"/>
+        <w:ind w:left="0"/>
       </w:pPr>
       <w:r>
         <w:rPr>
@@ -2923,7 +3015,7 @@
                     <pic:cNvPicPr preferRelativeResize="0"/>
                   </pic:nvPicPr>
                   <pic:blipFill>
-                    <a:blip r:embed="rId12"/>
+                    <a:blip r:embed="rId11"/>
                     <a:srcRect l="7474" r="19125"/>
                     <a:stretch>
                       <a:fillRect/>
@@ -2949,6 +3041,7 @@
     <w:p>
       <w:pPr>
         <w:spacing w:before="0"/>
+        <w:ind w:left="0"/>
       </w:pPr>
       <w:r>
         <w:rPr>
@@ -2968,7 +3061,7 @@
                     <pic:cNvPicPr preferRelativeResize="0"/>
                   </pic:nvPicPr>
                   <pic:blipFill>
-                    <a:blip r:embed="rId13"/>
+                    <a:blip r:embed="rId12"/>
                     <a:srcRect l="7882" t="27809" r="19013"/>
                     <a:stretch>
                       <a:fillRect/>
@@ -2992,12 +3085,8 @@
       </w:r>
     </w:p>
     <w:sectPr>
-      <w:headerReference w:type="even" r:id="rId14"/>
-      <w:headerReference w:type="default" r:id="rId15"/>
-      <w:footerReference w:type="even" r:id="rId16"/>
-      <w:footerReference w:type="default" r:id="rId17"/>
-      <w:headerReference w:type="first" r:id="rId18"/>
-      <w:footerReference w:type="first" r:id="rId19"/>
+      <w:headerReference w:type="default" r:id="rId13"/>
+      <w:footerReference w:type="default" r:id="rId14"/>
       <w:pgSz w:w="11906" w:h="16838"/>
       <w:pgMar w:top="1535" w:right="1701" w:bottom="1417" w:left="1701" w:header="567" w:footer="572" w:gutter="0"/>
       <w:pgNumType w:start="1"/>
@@ -3009,7 +3098,7 @@
 </file>
 
 <file path=word/endnotes.xml><?xml version="1.0" encoding="utf-8"?>
-<w:endnotes xmlns:wpc="http://schemas.microsoft.com/office/word/2010/wordprocessingCanvas" xmlns:cx="http://schemas.microsoft.com/office/drawing/2014/chartex" xmlns:cx1="http://schemas.microsoft.com/office/drawing/2015/9/8/chartex" xmlns:cx2="http://schemas.microsoft.com/office/drawing/2015/10/21/chartex" xmlns:cx3="http://schemas.microsoft.com/office/drawing/2016/5/9/chartex" xmlns:cx4="http://schemas.microsoft.com/office/drawing/2016/5/10/chartex" xmlns:cx5="http://schemas.microsoft.com/office/drawing/2016/5/11/chartex" xmlns:cx6="http://schemas.microsoft.com/office/drawing/2016/5/12/chartex" xmlns:cx7="http://schemas.microsoft.com/office/drawing/2016/5/13/chartex" xmlns:cx8="http://schemas.microsoft.com/office/drawing/2016/5/14/chartex" xmlns:mc="http://schemas.openxmlformats.org/markup-compatibility/2006" xmlns:aink="http://schemas.microsoft.com/office/drawing/2016/ink" xmlns:am3d="http://schemas.microsoft.com/office/drawing/2017/model3d" xmlns:o="urn:schemas-microsoft-com:office:office" xmlns:oel="http://schemas.microsoft.com/office/2019/extlst" xmlns:r="http://schemas.openxmlformats.org/officeDocument/2006/relationships" xmlns:m="http://schemas.openxmlformats.org/officeDocument/2006/math" xmlns:v="urn:schemas-microsoft-com:vml" xmlns:wp14="http://schemas.microsoft.com/office/word/2010/wordprocessingDrawing" xmlns:wp="http://schemas.openxmlformats.org/drawingml/2006/wordprocessingDrawing" xmlns:w10="urn:schemas-microsoft-com:office:word" xmlns:w="http://schemas.openxmlformats.org/wordprocessingml/2006/main" xmlns:w14="http://schemas.microsoft.com/office/word/2010/wordml" xmlns:w15="http://schemas.microsoft.com/office/word/2012/wordml" xmlns:w16cex="http://schemas.microsoft.com/office/word/2018/wordml/cex" xmlns:w16cid="http://schemas.microsoft.com/office/word/2016/wordml/cid" xmlns:w16="http://schemas.microsoft.com/office/word/2018/wordml" xmlns:w16du="http://schemas.microsoft.com/office/word/2023/wordml/word16du" xmlns:w16sdtdh="http://schemas.microsoft.com/office/word/2020/wordml/sdtdatahash" xmlns:w16sdtfl="http://schemas.microsoft.com/office/word/2024/wordml/sdtformatlock" xmlns:w16se="http://schemas.microsoft.com/office/word/2015/wordml/symex" xmlns:wpg="http://schemas.microsoft.com/office/word/2010/wordprocessingGroup" xmlns:wpi="http://schemas.microsoft.com/office/word/2010/wordprocessingInk" xmlns:wne="http://schemas.microsoft.com/office/word/2006/wordml" xmlns:wps="http://schemas.microsoft.com/office/word/2010/wordprocessingShape" mc:Ignorable="w14 w15 w16se w16cid w16 w16cex w16sdtdh w16sdtfl w16du wp14">
+<w:endnotes xmlns:wpc="http://schemas.microsoft.com/office/word/2010/wordprocessingCanvas" xmlns:cx="http://schemas.microsoft.com/office/drawing/2014/chartex" xmlns:cx1="http://schemas.microsoft.com/office/drawing/2015/9/8/chartex" xmlns:cx2="http://schemas.microsoft.com/office/drawing/2015/10/21/chartex" xmlns:cx3="http://schemas.microsoft.com/office/drawing/2016/5/9/chartex" xmlns:cx4="http://schemas.microsoft.com/office/drawing/2016/5/10/chartex" xmlns:cx5="http://schemas.microsoft.com/office/drawing/2016/5/11/chartex" xmlns:cx6="http://schemas.microsoft.com/office/drawing/2016/5/12/chartex" xmlns:cx7="http://schemas.microsoft.com/office/drawing/2016/5/13/chartex" xmlns:cx8="http://schemas.microsoft.com/office/drawing/2016/5/14/chartex" xmlns:mc="http://schemas.openxmlformats.org/markup-compatibility/2006" xmlns:aink="http://schemas.microsoft.com/office/drawing/2016/ink" xmlns:am3d="http://schemas.microsoft.com/office/drawing/2017/model3d" xmlns:o="urn:schemas-microsoft-com:office:office" xmlns:r="http://schemas.openxmlformats.org/officeDocument/2006/relationships" xmlns:m="http://schemas.openxmlformats.org/officeDocument/2006/math" xmlns:v="urn:schemas-microsoft-com:vml" xmlns:wp14="http://schemas.microsoft.com/office/word/2010/wordprocessingDrawing" xmlns:wp="http://schemas.openxmlformats.org/drawingml/2006/wordprocessingDrawing" xmlns:w10="urn:schemas-microsoft-com:office:word" xmlns:w="http://schemas.openxmlformats.org/wordprocessingml/2006/main" xmlns:w14="http://schemas.microsoft.com/office/word/2010/wordml" xmlns:w15="http://schemas.microsoft.com/office/word/2012/wordml" xmlns:w16cid="http://schemas.microsoft.com/office/word/2016/wordml/cid" xmlns:w16se="http://schemas.microsoft.com/office/word/2015/wordml/symex" xmlns:wpg="http://schemas.microsoft.com/office/word/2010/wordprocessingGroup" xmlns:wpi="http://schemas.microsoft.com/office/word/2010/wordprocessingInk" xmlns:wne="http://schemas.microsoft.com/office/word/2006/wordml" xmlns:wps="http://schemas.microsoft.com/office/word/2010/wordprocessingShape" mc:Ignorable="w14 w15 w16se w16cid wp14">
   <w:endnote w:type="separator" w:id="-1">
     <w:p>
       <w:pPr>
@@ -3034,17 +3123,7 @@
 </file>
 
 <file path=word/footer1.xml><?xml version="1.0" encoding="utf-8"?>
-<w:ftr xmlns:wpc="http://schemas.microsoft.com/office/word/2010/wordprocessingCanvas" xmlns:cx="http://schemas.microsoft.com/office/drawing/2014/chartex" xmlns:cx1="http://schemas.microsoft.com/office/drawing/2015/9/8/chartex" xmlns:cx2="http://schemas.microsoft.com/office/drawing/2015/10/21/chartex" xmlns:cx3="http://schemas.microsoft.com/office/drawing/2016/5/9/chartex" xmlns:cx4="http://schemas.microsoft.com/office/drawing/2016/5/10/chartex" xmlns:cx5="http://schemas.microsoft.com/office/drawing/2016/5/11/chartex" xmlns:cx6="http://schemas.microsoft.com/office/drawing/2016/5/12/chartex" xmlns:cx7="http://schemas.microsoft.com/office/drawing/2016/5/13/chartex" xmlns:cx8="http://schemas.microsoft.com/office/drawing/2016/5/14/chartex" xmlns:mc="http://schemas.openxmlformats.org/markup-compatibility/2006" xmlns:aink="http://schemas.microsoft.com/office/drawing/2016/ink" xmlns:am3d="http://schemas.microsoft.com/office/drawing/2017/model3d" xmlns:o="urn:schemas-microsoft-com:office:office" xmlns:oel="http://schemas.microsoft.com/office/2019/extlst" xmlns:r="http://schemas.openxmlformats.org/officeDocument/2006/relationships" xmlns:m="http://schemas.openxmlformats.org/officeDocument/2006/math" xmlns:v="urn:schemas-microsoft-com:vml" xmlns:wp14="http://schemas.microsoft.com/office/word/2010/wordprocessingDrawing" xmlns:wp="http://schemas.openxmlformats.org/drawingml/2006/wordprocessingDrawing" xmlns:w10="urn:schemas-microsoft-com:office:word" xmlns:w="http://schemas.openxmlformats.org/wordprocessingml/2006/main" xmlns:w14="http://schemas.microsoft.com/office/word/2010/wordml" xmlns:w15="http://schemas.microsoft.com/office/word/2012/wordml" xmlns:w16cex="http://schemas.microsoft.com/office/word/2018/wordml/cex" xmlns:w16cid="http://schemas.microsoft.com/office/word/2016/wordml/cid" xmlns:w16="http://schemas.microsoft.com/office/word/2018/wordml" xmlns:w16du="http://schemas.microsoft.com/office/word/2023/wordml/word16du" xmlns:w16sdtdh="http://schemas.microsoft.com/office/word/2020/wordml/sdtdatahash" xmlns:w16sdtfl="http://schemas.microsoft.com/office/word/2024/wordml/sdtformatlock" xmlns:w16se="http://schemas.microsoft.com/office/word/2015/wordml/symex" xmlns:wpg="http://schemas.microsoft.com/office/word/2010/wordprocessingGroup" xmlns:wpi="http://schemas.microsoft.com/office/word/2010/wordprocessingInk" xmlns:wne="http://schemas.microsoft.com/office/word/2006/wordml" xmlns:wps="http://schemas.microsoft.com/office/word/2010/wordprocessingShape" mc:Ignorable="w14 w15 w16se w16cid w16 w16cex w16sdtdh w16sdtfl w16du wp14">
-  <w:p>
-    <w:pPr>
-      <w:pStyle w:val="Piedepgina"/>
-    </w:pPr>
-  </w:p>
-</w:ftr>
-</file>
-
-<file path=word/footer2.xml><?xml version="1.0" encoding="utf-8"?>
-<w:ftr xmlns:wpc="http://schemas.microsoft.com/office/word/2010/wordprocessingCanvas" xmlns:cx="http://schemas.microsoft.com/office/drawing/2014/chartex" xmlns:cx1="http://schemas.microsoft.com/office/drawing/2015/9/8/chartex" xmlns:cx2="http://schemas.microsoft.com/office/drawing/2015/10/21/chartex" xmlns:cx3="http://schemas.microsoft.com/office/drawing/2016/5/9/chartex" xmlns:cx4="http://schemas.microsoft.com/office/drawing/2016/5/10/chartex" xmlns:cx5="http://schemas.microsoft.com/office/drawing/2016/5/11/chartex" xmlns:cx6="http://schemas.microsoft.com/office/drawing/2016/5/12/chartex" xmlns:cx7="http://schemas.microsoft.com/office/drawing/2016/5/13/chartex" xmlns:cx8="http://schemas.microsoft.com/office/drawing/2016/5/14/chartex" xmlns:mc="http://schemas.openxmlformats.org/markup-compatibility/2006" xmlns:aink="http://schemas.microsoft.com/office/drawing/2016/ink" xmlns:am3d="http://schemas.microsoft.com/office/drawing/2017/model3d" xmlns:o="urn:schemas-microsoft-com:office:office" xmlns:oel="http://schemas.microsoft.com/office/2019/extlst" xmlns:r="http://schemas.openxmlformats.org/officeDocument/2006/relationships" xmlns:m="http://schemas.openxmlformats.org/officeDocument/2006/math" xmlns:v="urn:schemas-microsoft-com:vml" xmlns:wp14="http://schemas.microsoft.com/office/word/2010/wordprocessingDrawing" xmlns:wp="http://schemas.openxmlformats.org/drawingml/2006/wordprocessingDrawing" xmlns:w10="urn:schemas-microsoft-com:office:word" xmlns:w="http://schemas.openxmlformats.org/wordprocessingml/2006/main" xmlns:w14="http://schemas.microsoft.com/office/word/2010/wordml" xmlns:w15="http://schemas.microsoft.com/office/word/2012/wordml" xmlns:w16cex="http://schemas.microsoft.com/office/word/2018/wordml/cex" xmlns:w16cid="http://schemas.microsoft.com/office/word/2016/wordml/cid" xmlns:w16="http://schemas.microsoft.com/office/word/2018/wordml" xmlns:w16du="http://schemas.microsoft.com/office/word/2023/wordml/word16du" xmlns:w16sdtdh="http://schemas.microsoft.com/office/word/2020/wordml/sdtdatahash" xmlns:w16sdtfl="http://schemas.microsoft.com/office/word/2024/wordml/sdtformatlock" xmlns:w16se="http://schemas.microsoft.com/office/word/2015/wordml/symex" xmlns:wpg="http://schemas.microsoft.com/office/word/2010/wordprocessingGroup" xmlns:wpi="http://schemas.microsoft.com/office/word/2010/wordprocessingInk" xmlns:wne="http://schemas.microsoft.com/office/word/2006/wordml" xmlns:wps="http://schemas.microsoft.com/office/word/2010/wordprocessingShape" mc:Ignorable="w14 w15 w16se w16cid w16 w16cex w16sdtdh w16sdtfl w16du wp14">
+<w:ftr xmlns:wpc="http://schemas.microsoft.com/office/word/2010/wordprocessingCanvas" xmlns:cx="http://schemas.microsoft.com/office/drawing/2014/chartex" xmlns:cx1="http://schemas.microsoft.com/office/drawing/2015/9/8/chartex" xmlns:cx2="http://schemas.microsoft.com/office/drawing/2015/10/21/chartex" xmlns:cx3="http://schemas.microsoft.com/office/drawing/2016/5/9/chartex" xmlns:cx4="http://schemas.microsoft.com/office/drawing/2016/5/10/chartex" xmlns:cx5="http://schemas.microsoft.com/office/drawing/2016/5/11/chartex" xmlns:cx6="http://schemas.microsoft.com/office/drawing/2016/5/12/chartex" xmlns:cx7="http://schemas.microsoft.com/office/drawing/2016/5/13/chartex" xmlns:cx8="http://schemas.microsoft.com/office/drawing/2016/5/14/chartex" xmlns:mc="http://schemas.openxmlformats.org/markup-compatibility/2006" xmlns:aink="http://schemas.microsoft.com/office/drawing/2016/ink" xmlns:am3d="http://schemas.microsoft.com/office/drawing/2017/model3d" xmlns:o="urn:schemas-microsoft-com:office:office" xmlns:r="http://schemas.openxmlformats.org/officeDocument/2006/relationships" xmlns:m="http://schemas.openxmlformats.org/officeDocument/2006/math" xmlns:v="urn:schemas-microsoft-com:vml" xmlns:wp14="http://schemas.microsoft.com/office/word/2010/wordprocessingDrawing" xmlns:wp="http://schemas.openxmlformats.org/drawingml/2006/wordprocessingDrawing" xmlns:w10="urn:schemas-microsoft-com:office:word" xmlns:w="http://schemas.openxmlformats.org/wordprocessingml/2006/main" xmlns:w14="http://schemas.microsoft.com/office/word/2010/wordml" xmlns:w15="http://schemas.microsoft.com/office/word/2012/wordml" xmlns:w16cid="http://schemas.microsoft.com/office/word/2016/wordml/cid" xmlns:w16se="http://schemas.microsoft.com/office/word/2015/wordml/symex" xmlns:wpg="http://schemas.microsoft.com/office/word/2010/wordprocessingGroup" xmlns:wpi="http://schemas.microsoft.com/office/word/2010/wordprocessingInk" xmlns:wne="http://schemas.microsoft.com/office/word/2006/wordml" xmlns:wps="http://schemas.microsoft.com/office/word/2010/wordprocessingShape" mc:Ignorable="w14 w15 w16se w16cid wp14">
   <w:p>
     <w:pPr>
       <w:tabs>
@@ -3138,7 +3217,7 @@
         <w:noProof/>
       </w:rPr>
       <mc:AlternateContent>
-        <mc:Choice Requires="wpg">
+        <mc:Choice Requires="wps">
           <w:drawing>
             <wp:anchor distT="0" distB="0" distL="114300" distR="114300" simplePos="0" relativeHeight="251664384" behindDoc="0" locked="0" layoutInCell="1" hidden="0" allowOverlap="1" wp14:anchorId="59555372" wp14:editId="396F2EAE">
               <wp:simplePos x="0" y="0"/>
@@ -3198,47 +3277,23 @@
             </wp:anchor>
           </w:drawing>
         </mc:Choice>
-        <mc:Fallback xmlns:cr="http://schemas.microsoft.com/office/comments/2020/reactions" xmlns="http://schemas.microsoft.com/office/tasks/2019/documenttasks" xmlns:dgm="http://schemas.openxmlformats.org/drawingml/2006/diagram" xmlns:lc="http://schemas.openxmlformats.org/drawingml/2006/lockedCanvas" xmlns:c="http://schemas.openxmlformats.org/drawingml/2006/chart" xmlns:pic="http://schemas.openxmlformats.org/drawingml/2006/picture" xmlns:a="http://schemas.openxmlformats.org/drawingml/2006/main" xmlns:sl="http://schemas.openxmlformats.org/schemaLibrary/2006/main">
-          <w:drawing>
-            <wp:anchor allowOverlap="1" behindDoc="0" distB="0" distT="0" distL="114300" distR="114300" hidden="0" layoutInCell="1" locked="0" relativeHeight="0" simplePos="0">
-              <wp:simplePos x="0" y="0"/>
-              <wp:positionH relativeFrom="column">
-                <wp:posOffset>5885181</wp:posOffset>
-              </wp:positionH>
-              <wp:positionV relativeFrom="paragraph">
-                <wp:posOffset>9878061</wp:posOffset>
-              </wp:positionV>
-              <wp:extent cx="109855" cy="808990"/>
-              <wp:effectExtent b="0" l="0" r="0" t="0"/>
-              <wp:wrapNone/>
-              <wp:docPr id="2100667897" name="image8.png"/>
-              <a:graphic>
-                <a:graphicData uri="http://schemas.openxmlformats.org/drawingml/2006/picture">
-                  <pic:pic>
-                    <pic:nvPicPr>
-                      <pic:cNvPr id="0" name="image8.png"/>
-                      <pic:cNvPicPr preferRelativeResize="0"/>
-                    </pic:nvPicPr>
-                    <pic:blipFill>
-                      <a:blip r:embed="rId1"/>
-                      <a:srcRect/>
-                      <a:stretch>
-                        <a:fillRect/>
-                      </a:stretch>
-                    </pic:blipFill>
-                    <pic:spPr>
-                      <a:xfrm>
-                        <a:off x="0" y="0"/>
-                        <a:ext cx="109855" cy="808990"/>
-                      </a:xfrm>
-                      <a:prstGeom prst="rect"/>
-                      <a:ln/>
-                    </pic:spPr>
-                  </pic:pic>
-                </a:graphicData>
-              </a:graphic>
-            </wp:anchor>
-          </w:drawing>
+        <mc:Fallback>
+          <w:pict>
+            <v:rect w14:anchorId="59555372" id="Rectángulo 2100667897" o:spid="_x0000_s1044" style="position:absolute;left:0;text-align:left;margin-left:463.4pt;margin-top:777.8pt;width:8.65pt;height:63.7pt;z-index:251664384;visibility:visible;mso-wrap-style:square;mso-wrap-distance-left:9pt;mso-wrap-distance-top:0;mso-wrap-distance-right:9pt;mso-wrap-distance-bottom:0;mso-position-horizontal:absolute;mso-position-horizontal-relative:text;mso-position-vertical:absolute;mso-position-vertical-relative:text;v-text-anchor:middle" o:gfxdata="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" fillcolor="#45acf1" strokecolor="#205867">
+              <v:stroke startarrowwidth="narrow" startarrowlength="short" endarrowwidth="narrow" endarrowlength="short"/>
+              <v:textbox inset="2.53958mm,2.53958mm,2.53958mm,2.53958mm">
+                <w:txbxContent>
+                  <w:p>
+                    <w:pPr>
+                      <w:spacing w:before="0" w:line="240" w:lineRule="auto"/>
+                      <w:ind w:left="0" w:hanging="357"/>
+                      <w:textDirection w:val="btLr"/>
+                    </w:pPr>
+                  </w:p>
+                </w:txbxContent>
+              </v:textbox>
+            </v:rect>
+          </w:pict>
         </mc:Fallback>
       </mc:AlternateContent>
     </w:r>
@@ -3247,7 +3302,7 @@
         <w:noProof/>
       </w:rPr>
       <mc:AlternateContent>
-        <mc:Choice Requires="wpg">
+        <mc:Choice Requires="wps">
           <w:drawing>
             <wp:anchor distT="0" distB="0" distL="114300" distR="114300" simplePos="0" relativeHeight="251665408" behindDoc="0" locked="0" layoutInCell="1" hidden="0" allowOverlap="1" wp14:anchorId="795EA31F" wp14:editId="3EA4DB44">
               <wp:simplePos x="0" y="0"/>
@@ -3307,47 +3362,23 @@
             </wp:anchor>
           </w:drawing>
         </mc:Choice>
-        <mc:Fallback xmlns:cr="http://schemas.microsoft.com/office/comments/2020/reactions" xmlns="http://schemas.microsoft.com/office/tasks/2019/documenttasks" xmlns:dgm="http://schemas.openxmlformats.org/drawingml/2006/diagram" xmlns:lc="http://schemas.openxmlformats.org/drawingml/2006/lockedCanvas" xmlns:c="http://schemas.openxmlformats.org/drawingml/2006/chart" xmlns:pic="http://schemas.openxmlformats.org/drawingml/2006/picture" xmlns:a="http://schemas.openxmlformats.org/drawingml/2006/main" xmlns:sl="http://schemas.openxmlformats.org/schemaLibrary/2006/main">
-          <w:drawing>
-            <wp:anchor allowOverlap="1" behindDoc="0" distB="0" distT="0" distL="114300" distR="114300" hidden="0" layoutInCell="1" locked="0" relativeHeight="0" simplePos="0">
-              <wp:simplePos x="0" y="0"/>
-              <wp:positionH relativeFrom="column">
-                <wp:posOffset>-594991</wp:posOffset>
-              </wp:positionH>
-              <wp:positionV relativeFrom="paragraph">
-                <wp:posOffset>9878061</wp:posOffset>
-              </wp:positionV>
-              <wp:extent cx="109855" cy="808990"/>
-              <wp:effectExtent b="0" l="0" r="0" t="0"/>
-              <wp:wrapNone/>
-              <wp:docPr id="2100667901" name="image12.png"/>
-              <a:graphic>
-                <a:graphicData uri="http://schemas.openxmlformats.org/drawingml/2006/picture">
-                  <pic:pic>
-                    <pic:nvPicPr>
-                      <pic:cNvPr id="0" name="image12.png"/>
-                      <pic:cNvPicPr preferRelativeResize="0"/>
-                    </pic:nvPicPr>
-                    <pic:blipFill>
-                      <a:blip r:embed="rId1"/>
-                      <a:srcRect/>
-                      <a:stretch>
-                        <a:fillRect/>
-                      </a:stretch>
-                    </pic:blipFill>
-                    <pic:spPr>
-                      <a:xfrm>
-                        <a:off x="0" y="0"/>
-                        <a:ext cx="109855" cy="808990"/>
-                      </a:xfrm>
-                      <a:prstGeom prst="rect"/>
-                      <a:ln/>
-                    </pic:spPr>
-                  </pic:pic>
-                </a:graphicData>
-              </a:graphic>
-            </wp:anchor>
-          </w:drawing>
+        <mc:Fallback>
+          <w:pict>
+            <v:rect w14:anchorId="795EA31F" id="Rectángulo 2100667901" o:spid="_x0000_s1045" style="position:absolute;left:0;text-align:left;margin-left:-46.85pt;margin-top:777.8pt;width:8.65pt;height:63.7pt;z-index:251665408;visibility:visible;mso-wrap-style:square;mso-wrap-distance-left:9pt;mso-wrap-distance-top:0;mso-wrap-distance-right:9pt;mso-wrap-distance-bottom:0;mso-position-horizontal:absolute;mso-position-horizontal-relative:text;mso-position-vertical:absolute;mso-position-vertical-relative:text;v-text-anchor:middle" o:gfxdata="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" fillcolor="#45acf1" strokecolor="#205867">
+              <v:stroke startarrowwidth="narrow" startarrowlength="short" endarrowwidth="narrow" endarrowlength="short"/>
+              <v:textbox inset="2.53958mm,2.53958mm,2.53958mm,2.53958mm">
+                <w:txbxContent>
+                  <w:p>
+                    <w:pPr>
+                      <w:spacing w:before="0" w:line="240" w:lineRule="auto"/>
+                      <w:ind w:left="0" w:hanging="357"/>
+                      <w:textDirection w:val="btLr"/>
+                    </w:pPr>
+                  </w:p>
+                </w:txbxContent>
+              </v:textbox>
+            </v:rect>
+          </w:pict>
         </mc:Fallback>
       </mc:AlternateContent>
     </w:r>
@@ -3401,7 +3432,7 @@
             </wp:anchor>
           </w:drawing>
         </mc:Choice>
-        <mc:Fallback xmlns:cr="http://schemas.microsoft.com/office/comments/2020/reactions" xmlns="http://schemas.microsoft.com/office/tasks/2019/documenttasks" xmlns:dgm="http://schemas.openxmlformats.org/drawingml/2006/diagram" xmlns:lc="http://schemas.openxmlformats.org/drawingml/2006/lockedCanvas" xmlns:c="http://schemas.openxmlformats.org/drawingml/2006/chart" xmlns:pic="http://schemas.openxmlformats.org/drawingml/2006/picture" xmlns:a="http://schemas.openxmlformats.org/drawingml/2006/main" xmlns:sl="http://schemas.openxmlformats.org/schemaLibrary/2006/main">
+        <mc:Fallback xmlns:sl="http://schemas.openxmlformats.org/schemaLibrary/2006/main" xmlns:a="http://schemas.openxmlformats.org/drawingml/2006/main" xmlns:pic="http://schemas.openxmlformats.org/drawingml/2006/picture" xmlns:c="http://schemas.openxmlformats.org/drawingml/2006/chart" xmlns:lc="http://schemas.openxmlformats.org/drawingml/2006/lockedCanvas" xmlns:dgm="http://schemas.openxmlformats.org/drawingml/2006/diagram" xmlns="http://schemas.microsoft.com/office/tasks/2019/documenttasks" xmlns:cr="http://schemas.microsoft.com/office/comments/2020/reactions" xmlns:w16sdtfl="http://schemas.microsoft.com/office/word/2024/wordml/sdtformatlock" xmlns:w16sdtdh="http://schemas.microsoft.com/office/word/2020/wordml/sdtdatahash" xmlns:w16du="http://schemas.microsoft.com/office/word/2023/wordml/word16du" xmlns:w16="http://schemas.microsoft.com/office/word/2018/wordml" xmlns:w16cex="http://schemas.microsoft.com/office/word/2018/wordml/cex" xmlns:oel="http://schemas.microsoft.com/office/2019/extlst">
           <w:drawing>
             <wp:anchor allowOverlap="1" behindDoc="0" distB="0" distT="0" distL="114300" distR="114300" hidden="0" layoutInCell="1" locked="0" relativeHeight="0" simplePos="0">
               <wp:simplePos x="0" y="0"/>
@@ -3458,18 +3489,8 @@
 </w:ftr>
 </file>
 
-<file path=word/footer3.xml><?xml version="1.0" encoding="utf-8"?>
-<w:ftr xmlns:wpc="http://schemas.microsoft.com/office/word/2010/wordprocessingCanvas" xmlns:cx="http://schemas.microsoft.com/office/drawing/2014/chartex" xmlns:cx1="http://schemas.microsoft.com/office/drawing/2015/9/8/chartex" xmlns:cx2="http://schemas.microsoft.com/office/drawing/2015/10/21/chartex" xmlns:cx3="http://schemas.microsoft.com/office/drawing/2016/5/9/chartex" xmlns:cx4="http://schemas.microsoft.com/office/drawing/2016/5/10/chartex" xmlns:cx5="http://schemas.microsoft.com/office/drawing/2016/5/11/chartex" xmlns:cx6="http://schemas.microsoft.com/office/drawing/2016/5/12/chartex" xmlns:cx7="http://schemas.microsoft.com/office/drawing/2016/5/13/chartex" xmlns:cx8="http://schemas.microsoft.com/office/drawing/2016/5/14/chartex" xmlns:mc="http://schemas.openxmlformats.org/markup-compatibility/2006" xmlns:aink="http://schemas.microsoft.com/office/drawing/2016/ink" xmlns:am3d="http://schemas.microsoft.com/office/drawing/2017/model3d" xmlns:o="urn:schemas-microsoft-com:office:office" xmlns:oel="http://schemas.microsoft.com/office/2019/extlst" xmlns:r="http://schemas.openxmlformats.org/officeDocument/2006/relationships" xmlns:m="http://schemas.openxmlformats.org/officeDocument/2006/math" xmlns:v="urn:schemas-microsoft-com:vml" xmlns:wp14="http://schemas.microsoft.com/office/word/2010/wordprocessingDrawing" xmlns:wp="http://schemas.openxmlformats.org/drawingml/2006/wordprocessingDrawing" xmlns:w10="urn:schemas-microsoft-com:office:word" xmlns:w="http://schemas.openxmlformats.org/wordprocessingml/2006/main" xmlns:w14="http://schemas.microsoft.com/office/word/2010/wordml" xmlns:w15="http://schemas.microsoft.com/office/word/2012/wordml" xmlns:w16cex="http://schemas.microsoft.com/office/word/2018/wordml/cex" xmlns:w16cid="http://schemas.microsoft.com/office/word/2016/wordml/cid" xmlns:w16="http://schemas.microsoft.com/office/word/2018/wordml" xmlns:w16du="http://schemas.microsoft.com/office/word/2023/wordml/word16du" xmlns:w16sdtdh="http://schemas.microsoft.com/office/word/2020/wordml/sdtdatahash" xmlns:w16sdtfl="http://schemas.microsoft.com/office/word/2024/wordml/sdtformatlock" xmlns:w16se="http://schemas.microsoft.com/office/word/2015/wordml/symex" xmlns:wpg="http://schemas.microsoft.com/office/word/2010/wordprocessingGroup" xmlns:wpi="http://schemas.microsoft.com/office/word/2010/wordprocessingInk" xmlns:wne="http://schemas.microsoft.com/office/word/2006/wordml" xmlns:wps="http://schemas.microsoft.com/office/word/2010/wordprocessingShape" mc:Ignorable="w14 w15 w16se w16cid w16 w16cex w16sdtdh w16sdtfl w16du wp14">
-  <w:p>
-    <w:pPr>
-      <w:pStyle w:val="Piedepgina"/>
-    </w:pPr>
-  </w:p>
-</w:ftr>
-</file>
-
 <file path=word/footnotes.xml><?xml version="1.0" encoding="utf-8"?>
-<w:footnotes xmlns:wpc="http://schemas.microsoft.com/office/word/2010/wordprocessingCanvas" xmlns:cx="http://schemas.microsoft.com/office/drawing/2014/chartex" xmlns:cx1="http://schemas.microsoft.com/office/drawing/2015/9/8/chartex" xmlns:cx2="http://schemas.microsoft.com/office/drawing/2015/10/21/chartex" xmlns:cx3="http://schemas.microsoft.com/office/drawing/2016/5/9/chartex" xmlns:cx4="http://schemas.microsoft.com/office/drawing/2016/5/10/chartex" xmlns:cx5="http://schemas.microsoft.com/office/drawing/2016/5/11/chartex" xmlns:cx6="http://schemas.microsoft.com/office/drawing/2016/5/12/chartex" xmlns:cx7="http://schemas.microsoft.com/office/drawing/2016/5/13/chartex" xmlns:cx8="http://schemas.microsoft.com/office/drawing/2016/5/14/chartex" xmlns:mc="http://schemas.openxmlformats.org/markup-compatibility/2006" xmlns:aink="http://schemas.microsoft.com/office/drawing/2016/ink" xmlns:am3d="http://schemas.microsoft.com/office/drawing/2017/model3d" xmlns:o="urn:schemas-microsoft-com:office:office" xmlns:oel="http://schemas.microsoft.com/office/2019/extlst" xmlns:r="http://schemas.openxmlformats.org/officeDocument/2006/relationships" xmlns:m="http://schemas.openxmlformats.org/officeDocument/2006/math" xmlns:v="urn:schemas-microsoft-com:vml" xmlns:wp14="http://schemas.microsoft.com/office/word/2010/wordprocessingDrawing" xmlns:wp="http://schemas.openxmlformats.org/drawingml/2006/wordprocessingDrawing" xmlns:w10="urn:schemas-microsoft-com:office:word" xmlns:w="http://schemas.openxmlformats.org/wordprocessingml/2006/main" xmlns:w14="http://schemas.microsoft.com/office/word/2010/wordml" xmlns:w15="http://schemas.microsoft.com/office/word/2012/wordml" xmlns:w16cex="http://schemas.microsoft.com/office/word/2018/wordml/cex" xmlns:w16cid="http://schemas.microsoft.com/office/word/2016/wordml/cid" xmlns:w16="http://schemas.microsoft.com/office/word/2018/wordml" xmlns:w16du="http://schemas.microsoft.com/office/word/2023/wordml/word16du" xmlns:w16sdtdh="http://schemas.microsoft.com/office/word/2020/wordml/sdtdatahash" xmlns:w16sdtfl="http://schemas.microsoft.com/office/word/2024/wordml/sdtformatlock" xmlns:w16se="http://schemas.microsoft.com/office/word/2015/wordml/symex" xmlns:wpg="http://schemas.microsoft.com/office/word/2010/wordprocessingGroup" xmlns:wpi="http://schemas.microsoft.com/office/word/2010/wordprocessingInk" xmlns:wne="http://schemas.microsoft.com/office/word/2006/wordml" xmlns:wps="http://schemas.microsoft.com/office/word/2010/wordprocessingShape" mc:Ignorable="w14 w15 w16se w16cid w16 w16cex w16sdtdh w16sdtfl w16du wp14">
+<w:footnotes xmlns:wpc="http://schemas.microsoft.com/office/word/2010/wordprocessingCanvas" xmlns:cx="http://schemas.microsoft.com/office/drawing/2014/chartex" xmlns:cx1="http://schemas.microsoft.com/office/drawing/2015/9/8/chartex" xmlns:cx2="http://schemas.microsoft.com/office/drawing/2015/10/21/chartex" xmlns:cx3="http://schemas.microsoft.com/office/drawing/2016/5/9/chartex" xmlns:cx4="http://schemas.microsoft.com/office/drawing/2016/5/10/chartex" xmlns:cx5="http://schemas.microsoft.com/office/drawing/2016/5/11/chartex" xmlns:cx6="http://schemas.microsoft.com/office/drawing/2016/5/12/chartex" xmlns:cx7="http://schemas.microsoft.com/office/drawing/2016/5/13/chartex" xmlns:cx8="http://schemas.microsoft.com/office/drawing/2016/5/14/chartex" xmlns:mc="http://schemas.openxmlformats.org/markup-compatibility/2006" xmlns:aink="http://schemas.microsoft.com/office/drawing/2016/ink" xmlns:am3d="http://schemas.microsoft.com/office/drawing/2017/model3d" xmlns:o="urn:schemas-microsoft-com:office:office" xmlns:r="http://schemas.openxmlformats.org/officeDocument/2006/relationships" xmlns:m="http://schemas.openxmlformats.org/officeDocument/2006/math" xmlns:v="urn:schemas-microsoft-com:vml" xmlns:wp14="http://schemas.microsoft.com/office/word/2010/wordprocessingDrawing" xmlns:wp="http://schemas.openxmlformats.org/drawingml/2006/wordprocessingDrawing" xmlns:w10="urn:schemas-microsoft-com:office:word" xmlns:w="http://schemas.openxmlformats.org/wordprocessingml/2006/main" xmlns:w14="http://schemas.microsoft.com/office/word/2010/wordml" xmlns:w15="http://schemas.microsoft.com/office/word/2012/wordml" xmlns:w16cid="http://schemas.microsoft.com/office/word/2016/wordml/cid" xmlns:w16se="http://schemas.microsoft.com/office/word/2015/wordml/symex" xmlns:wpg="http://schemas.microsoft.com/office/word/2010/wordprocessingGroup" xmlns:wpi="http://schemas.microsoft.com/office/word/2010/wordprocessingInk" xmlns:wne="http://schemas.microsoft.com/office/word/2006/wordml" xmlns:wps="http://schemas.microsoft.com/office/word/2010/wordprocessingShape" mc:Ignorable="w14 w15 w16se w16cid wp14">
   <w:footnote w:type="separator" w:id="-1">
     <w:p>
       <w:pPr>
@@ -3494,17 +3515,7 @@
 </file>
 
 <file path=word/header1.xml><?xml version="1.0" encoding="utf-8"?>
-<w:hdr xmlns:wpc="http://schemas.microsoft.com/office/word/2010/wordprocessingCanvas" xmlns:cx="http://schemas.microsoft.com/office/drawing/2014/chartex" xmlns:cx1="http://schemas.microsoft.com/office/drawing/2015/9/8/chartex" xmlns:cx2="http://schemas.microsoft.com/office/drawing/2015/10/21/chartex" xmlns:cx3="http://schemas.microsoft.com/office/drawing/2016/5/9/chartex" xmlns:cx4="http://schemas.microsoft.com/office/drawing/2016/5/10/chartex" xmlns:cx5="http://schemas.microsoft.com/office/drawing/2016/5/11/chartex" xmlns:cx6="http://schemas.microsoft.com/office/drawing/2016/5/12/chartex" xmlns:cx7="http://schemas.microsoft.com/office/drawing/2016/5/13/chartex" xmlns:cx8="http://schemas.microsoft.com/office/drawing/2016/5/14/chartex" xmlns:mc="http://schemas.openxmlformats.org/markup-compatibility/2006" xmlns:aink="http://schemas.microsoft.com/office/drawing/2016/ink" xmlns:am3d="http://schemas.microsoft.com/office/drawing/2017/model3d" xmlns:o="urn:schemas-microsoft-com:office:office" xmlns:oel="http://schemas.microsoft.com/office/2019/extlst" xmlns:r="http://schemas.openxmlformats.org/officeDocument/2006/relationships" xmlns:m="http://schemas.openxmlformats.org/officeDocument/2006/math" xmlns:v="urn:schemas-microsoft-com:vml" xmlns:wp14="http://schemas.microsoft.com/office/word/2010/wordprocessingDrawing" xmlns:wp="http://schemas.openxmlformats.org/drawingml/2006/wordprocessingDrawing" xmlns:w10="urn:schemas-microsoft-com:office:word" xmlns:w="http://schemas.openxmlformats.org/wordprocessingml/2006/main" xmlns:w14="http://schemas.microsoft.com/office/word/2010/wordml" xmlns:w15="http://schemas.microsoft.com/office/word/2012/wordml" xmlns:w16cex="http://schemas.microsoft.com/office/word/2018/wordml/cex" xmlns:w16cid="http://schemas.microsoft.com/office/word/2016/wordml/cid" xmlns:w16="http://schemas.microsoft.com/office/word/2018/wordml" xmlns:w16du="http://schemas.microsoft.com/office/word/2023/wordml/word16du" xmlns:w16sdtdh="http://schemas.microsoft.com/office/word/2020/wordml/sdtdatahash" xmlns:w16sdtfl="http://schemas.microsoft.com/office/word/2024/wordml/sdtformatlock" xmlns:w16se="http://schemas.microsoft.com/office/word/2015/wordml/symex" xmlns:wpg="http://schemas.microsoft.com/office/word/2010/wordprocessingGroup" xmlns:wpi="http://schemas.microsoft.com/office/word/2010/wordprocessingInk" xmlns:wne="http://schemas.microsoft.com/office/word/2006/wordml" xmlns:wps="http://schemas.microsoft.com/office/word/2010/wordprocessingShape" mc:Ignorable="w14 w15 w16se w16cid w16 w16cex w16sdtdh w16sdtfl w16du wp14">
-  <w:p>
-    <w:pPr>
-      <w:pStyle w:val="Encabezado"/>
-    </w:pPr>
-  </w:p>
-</w:hdr>
-</file>
-
-<file path=word/header2.xml><?xml version="1.0" encoding="utf-8"?>
-<w:hdr xmlns:wpc="http://schemas.microsoft.com/office/word/2010/wordprocessingCanvas" xmlns:cx="http://schemas.microsoft.com/office/drawing/2014/chartex" xmlns:cx1="http://schemas.microsoft.com/office/drawing/2015/9/8/chartex" xmlns:cx2="http://schemas.microsoft.com/office/drawing/2015/10/21/chartex" xmlns:cx3="http://schemas.microsoft.com/office/drawing/2016/5/9/chartex" xmlns:cx4="http://schemas.microsoft.com/office/drawing/2016/5/10/chartex" xmlns:cx5="http://schemas.microsoft.com/office/drawing/2016/5/11/chartex" xmlns:cx6="http://schemas.microsoft.com/office/drawing/2016/5/12/chartex" xmlns:cx7="http://schemas.microsoft.com/office/drawing/2016/5/13/chartex" xmlns:cx8="http://schemas.microsoft.com/office/drawing/2016/5/14/chartex" xmlns:mc="http://schemas.openxmlformats.org/markup-compatibility/2006" xmlns:aink="http://schemas.microsoft.com/office/drawing/2016/ink" xmlns:am3d="http://schemas.microsoft.com/office/drawing/2017/model3d" xmlns:o="urn:schemas-microsoft-com:office:office" xmlns:oel="http://schemas.microsoft.com/office/2019/extlst" xmlns:r="http://schemas.openxmlformats.org/officeDocument/2006/relationships" xmlns:m="http://schemas.openxmlformats.org/officeDocument/2006/math" xmlns:v="urn:schemas-microsoft-com:vml" xmlns:wp14="http://schemas.microsoft.com/office/word/2010/wordprocessingDrawing" xmlns:wp="http://schemas.openxmlformats.org/drawingml/2006/wordprocessingDrawing" xmlns:w10="urn:schemas-microsoft-com:office:word" xmlns:w="http://schemas.openxmlformats.org/wordprocessingml/2006/main" xmlns:w14="http://schemas.microsoft.com/office/word/2010/wordml" xmlns:w15="http://schemas.microsoft.com/office/word/2012/wordml" xmlns:w16cex="http://schemas.microsoft.com/office/word/2018/wordml/cex" xmlns:w16cid="http://schemas.microsoft.com/office/word/2016/wordml/cid" xmlns:w16="http://schemas.microsoft.com/office/word/2018/wordml" xmlns:w16du="http://schemas.microsoft.com/office/word/2023/wordml/word16du" xmlns:w16sdtdh="http://schemas.microsoft.com/office/word/2020/wordml/sdtdatahash" xmlns:w16sdtfl="http://schemas.microsoft.com/office/word/2024/wordml/sdtformatlock" xmlns:w16se="http://schemas.microsoft.com/office/word/2015/wordml/symex" xmlns:wpg="http://schemas.microsoft.com/office/word/2010/wordprocessingGroup" xmlns:wpi="http://schemas.microsoft.com/office/word/2010/wordprocessingInk" xmlns:wne="http://schemas.microsoft.com/office/word/2006/wordml" xmlns:wps="http://schemas.microsoft.com/office/word/2010/wordprocessingShape" mc:Ignorable="w14 w15 w16se w16cid w16 w16cex w16sdtdh w16sdtfl w16du wp14">
+<w:hdr xmlns:wpc="http://schemas.microsoft.com/office/word/2010/wordprocessingCanvas" xmlns:cx="http://schemas.microsoft.com/office/drawing/2014/chartex" xmlns:cx1="http://schemas.microsoft.com/office/drawing/2015/9/8/chartex" xmlns:cx2="http://schemas.microsoft.com/office/drawing/2015/10/21/chartex" xmlns:cx3="http://schemas.microsoft.com/office/drawing/2016/5/9/chartex" xmlns:cx4="http://schemas.microsoft.com/office/drawing/2016/5/10/chartex" xmlns:cx5="http://schemas.microsoft.com/office/drawing/2016/5/11/chartex" xmlns:cx6="http://schemas.microsoft.com/office/drawing/2016/5/12/chartex" xmlns:cx7="http://schemas.microsoft.com/office/drawing/2016/5/13/chartex" xmlns:cx8="http://schemas.microsoft.com/office/drawing/2016/5/14/chartex" xmlns:mc="http://schemas.openxmlformats.org/markup-compatibility/2006" xmlns:aink="http://schemas.microsoft.com/office/drawing/2016/ink" xmlns:am3d="http://schemas.microsoft.com/office/drawing/2017/model3d" xmlns:o="urn:schemas-microsoft-com:office:office" xmlns:r="http://schemas.openxmlformats.org/officeDocument/2006/relationships" xmlns:m="http://schemas.openxmlformats.org/officeDocument/2006/math" xmlns:v="urn:schemas-microsoft-com:vml" xmlns:wp14="http://schemas.microsoft.com/office/word/2010/wordprocessingDrawing" xmlns:wp="http://schemas.openxmlformats.org/drawingml/2006/wordprocessingDrawing" xmlns:w10="urn:schemas-microsoft-com:office:word" xmlns:w="http://schemas.openxmlformats.org/wordprocessingml/2006/main" xmlns:w14="http://schemas.microsoft.com/office/word/2010/wordml" xmlns:w15="http://schemas.microsoft.com/office/word/2012/wordml" xmlns:w16cid="http://schemas.microsoft.com/office/word/2016/wordml/cid" xmlns:w16se="http://schemas.microsoft.com/office/word/2015/wordml/symex" xmlns:wpg="http://schemas.microsoft.com/office/word/2010/wordprocessingGroup" xmlns:wpi="http://schemas.microsoft.com/office/word/2010/wordprocessingInk" xmlns:wne="http://schemas.microsoft.com/office/word/2006/wordml" xmlns:wps="http://schemas.microsoft.com/office/word/2010/wordprocessingShape" mc:Ignorable="w14 w15 w16se w16cid wp14">
   <w:p>
     <w:pPr>
       <w:pBdr>
@@ -3627,7 +3638,7 @@
         </mc:Choice>
         <mc:Fallback>
           <w:pict>
-            <v:group w14:anchorId="5CC5C7DB" id="Grupo 22" o:spid="_x0000_s1032" style="position:absolute;left:0;text-align:left;margin-left:-85.05pt;margin-top:-85.35pt;width:598.05pt;height:879.1pt;rotation:180;flip:x;z-index:251662336" coordorigin="8,9" coordsize="15940,19845" o:gfxdata="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">
+            <v:group w14:anchorId="5CC5C7DB" id="Grupo 22" o:spid="_x0000_s1032" style="position:absolute;left:0;text-align:left;margin-left:-85.05pt;margin-top:-85.35pt;width:598.05pt;height:879.1pt;rotation:180;flip:x;z-index:251662336" coordorigin="8,9" coordsize="15940,19845" o:gfxdata="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">
               <v:rect id="Rectángulo 1498262023" o:spid="_x0000_s1033" style="position:absolute;left:148;top:18429;width:15800;height:1425;visibility:visible;mso-wrap-style:square;v-text-anchor:middle" o:gfxdata="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" filled="f" stroked="f">
                 <v:textbox inset="2.53958mm,2.53958mm,2.53958mm,2.53958mm">
                   <w:txbxContent>
@@ -3658,9 +3669,6 @@
           </w:pict>
         </mc:Fallback>
       </mc:AlternateContent>
-    </w:r>
-    <w:r>
-      <w:t xml:space="preserve">       </w:t>
     </w:r>
     <w:r>
       <w:rPr>
@@ -3736,7 +3744,7 @@
         </mc:Choice>
         <mc:Fallback>
           <w:pict>
-            <v:rect w14:anchorId="025F32A3" id="Rectángulo 2100667900" o:spid="_x0000_s1035" style="position:absolute;left:0;text-align:left;margin-left:548.85pt;margin-top:0;width:8.65pt;height:63.7pt;z-index:251657216;visibility:visible;mso-wrap-style:square;mso-wrap-distance-left:9pt;mso-wrap-distance-top:0;mso-wrap-distance-right:9pt;mso-wrap-distance-bottom:0;mso-position-horizontal:absolute;mso-position-horizontal-relative:page;mso-position-vertical:top;mso-position-vertical-relative:page;v-text-anchor:middle" o:gfxdata="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" fillcolor="#45adf3" strokecolor="#205867">
+            <v:rect w14:anchorId="025F32A3" id="Rectángulo 2100667900" o:spid="_x0000_s1035" style="position:absolute;left:0;text-align:left;margin-left:548.85pt;margin-top:0;width:8.65pt;height:63.7pt;z-index:251657216;visibility:visible;mso-wrap-style:square;mso-wrap-distance-left:9pt;mso-wrap-distance-top:0;mso-wrap-distance-right:9pt;mso-wrap-distance-bottom:0;mso-position-horizontal:absolute;mso-position-horizontal-relative:page;mso-position-vertical:top;mso-position-vertical-relative:page;v-text-anchor:middle" o:gfxdata="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" fillcolor="#45adf3" strokecolor="#205867">
               <v:stroke startarrowwidth="narrow" startarrowlength="short" endarrowwidth="narrow" endarrowlength="short"/>
               <v:textbox inset="2.53958mm,2.53958mm,2.53958mm,2.53958mm">
                 <w:txbxContent>
@@ -3823,7 +3831,7 @@
         </mc:Choice>
         <mc:Fallback>
           <w:pict>
-            <v:rect w14:anchorId="69F5BD8A" id="Rectángulo 2100667908" o:spid="_x0000_s1036" style="position:absolute;left:0;text-align:left;margin-left:38.7pt;margin-top:.05pt;width:8.65pt;height:63.7pt;z-index:251658240;visibility:visible;mso-wrap-style:square;mso-wrap-distance-left:9pt;mso-wrap-distance-top:0;mso-wrap-distance-right:9pt;mso-wrap-distance-bottom:0;mso-position-horizontal:absolute;mso-position-horizontal-relative:page;mso-position-vertical:absolute;mso-position-vertical-relative:page;v-text-anchor:middle" o:gfxdata="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" fillcolor="#45adf3" strokecolor="#205867">
+            <v:rect w14:anchorId="69F5BD8A" id="Rectángulo 2100667908" o:spid="_x0000_s1036" style="position:absolute;left:0;text-align:left;margin-left:38.7pt;margin-top:.05pt;width:8.65pt;height:63.7pt;z-index:251658240;visibility:visible;mso-wrap-style:square;mso-wrap-distance-left:9pt;mso-wrap-distance-top:0;mso-wrap-distance-right:9pt;mso-wrap-distance-bottom:0;mso-position-horizontal:absolute;mso-position-horizontal-relative:page;mso-position-vertical:absolute;mso-position-vertical-relative:page;v-text-anchor:middle" o:gfxdata="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" fillcolor="#45adf3" strokecolor="#205867">
               <v:stroke startarrowwidth="narrow" startarrowlength="short" endarrowwidth="narrow" endarrowlength="short"/>
               <v:textbox inset="2.53958mm,2.53958mm,2.53958mm,2.53958mm">
                 <w:txbxContent>
@@ -4141,47 +4149,62 @@
             </wp:anchor>
           </w:drawing>
         </mc:Choice>
-        <mc:Fallback xmlns:cr="http://schemas.microsoft.com/office/comments/2020/reactions" xmlns="http://schemas.microsoft.com/office/tasks/2019/documenttasks" xmlns:dgm="http://schemas.openxmlformats.org/drawingml/2006/diagram" xmlns:lc="http://schemas.openxmlformats.org/drawingml/2006/lockedCanvas" xmlns:c="http://schemas.openxmlformats.org/drawingml/2006/chart" xmlns:pic="http://schemas.openxmlformats.org/drawingml/2006/picture" xmlns:a="http://schemas.openxmlformats.org/drawingml/2006/main" xmlns:sl="http://schemas.openxmlformats.org/schemaLibrary/2006/main">
-          <w:drawing>
-            <wp:anchor allowOverlap="1" behindDoc="0" distB="0" distT="0" distL="114300" distR="114300" hidden="0" layoutInCell="1" locked="0" relativeHeight="0" simplePos="0">
-              <wp:simplePos x="0" y="0"/>
-              <wp:positionH relativeFrom="page">
-                <wp:align>center</wp:align>
-              </wp:positionH>
-              <wp:positionV relativeFrom="page">
-                <wp:align>top</wp:align>
-              </wp:positionV>
-              <wp:extent cx="7537450" cy="815340"/>
-              <wp:effectExtent b="0" l="0" r="0" t="0"/>
-              <wp:wrapNone/>
-              <wp:docPr id="2100667907" name="image18.png"/>
-              <a:graphic>
-                <a:graphicData uri="http://schemas.openxmlformats.org/drawingml/2006/picture">
-                  <pic:pic>
-                    <pic:nvPicPr>
-                      <pic:cNvPr id="0" name="image18.png"/>
-                      <pic:cNvPicPr preferRelativeResize="0"/>
-                    </pic:nvPicPr>
-                    <pic:blipFill>
-                      <a:blip r:embed="rId3"/>
-                      <a:srcRect/>
-                      <a:stretch>
-                        <a:fillRect/>
-                      </a:stretch>
-                    </pic:blipFill>
-                    <pic:spPr>
-                      <a:xfrm>
-                        <a:off x="0" y="0"/>
-                        <a:ext cx="7537450" cy="815340"/>
-                      </a:xfrm>
-                      <a:prstGeom prst="rect"/>
-                      <a:ln/>
-                    </pic:spPr>
-                  </pic:pic>
-                </a:graphicData>
-              </a:graphic>
-            </wp:anchor>
-          </w:drawing>
+        <mc:Fallback>
+          <w:pict>
+            <v:group w14:anchorId="5ACD3E29" id="Grupo 2100667907" o:spid="_x0000_s1037" style="position:absolute;margin-left:0;margin-top:0;width:593.5pt;height:64.2pt;z-index:251663360;mso-position-horizontal:center;mso-position-horizontal-relative:page;mso-position-vertical:top;mso-position-vertical-relative:page" coordorigin="15772,33723" coordsize="75374,8153" o:gfxdata="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">
+              <v:group id="Grupo 937252075" o:spid="_x0000_s1038" style="position:absolute;left:15772;top:33723;width:75375;height:8153" coordorigin="15772,33723" coordsize="75374,8153" o:gfxdata="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">
+                <v:rect id="Rectángulo 1885338877" o:spid="_x0000_s1039" style="position:absolute;left:15772;top:33723;width:75375;height:8153;visibility:visible;mso-wrap-style:square;v-text-anchor:middle" o:gfxdata="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" filled="f" stroked="f">
+                  <v:textbox inset="2.53958mm,2.53958mm,2.53958mm,2.53958mm">
+                    <w:txbxContent>
+                      <w:p>
+                        <w:pPr>
+                          <w:spacing w:before="0" w:line="240" w:lineRule="auto"/>
+                          <w:ind w:left="0"/>
+                          <w:textDirection w:val="btLr"/>
+                        </w:pPr>
+                      </w:p>
+                    </w:txbxContent>
+                  </v:textbox>
+                </v:rect>
+                <v:group id="Grupo 2080869410" o:spid="_x0000_s1040" style="position:absolute;left:15772;top:33723;width:75375;height:8153" coordorigin="8,9" coordsize="15823,1439" o:gfxdata="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">
+                  <v:rect id="Rectángulo 150048455" o:spid="_x0000_s1041" style="position:absolute;left:8;top:9;width:15800;height:1425;visibility:visible;mso-wrap-style:square;v-text-anchor:middle" o:gfxdata="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" filled="f" stroked="f">
+                    <v:textbox inset="2.53958mm,2.53958mm,2.53958mm,2.53958mm">
+                      <w:txbxContent>
+                        <w:p>
+                          <w:pPr>
+                            <w:spacing w:before="0" w:line="240" w:lineRule="auto"/>
+                            <w:ind w:left="0" w:hanging="357"/>
+                            <w:textDirection w:val="btLr"/>
+                          </w:pPr>
+                        </w:p>
+                      </w:txbxContent>
+                    </v:textbox>
+                  </v:rect>
+                  <v:shapetype id="_x0000_t32" coordsize="21600,21600" o:spt="32" o:oned="t" path="m,l21600,21600e" filled="f">
+                    <v:path arrowok="t" fillok="f" o:connecttype="none"/>
+                    <o:lock v:ext="edit" shapetype="t"/>
+                  </v:shapetype>
+                  <v:shape id="Conector recto de flecha 1501222632" o:spid="_x0000_s1042" type="#_x0000_t32" style="position:absolute;left:9;top:1431;width:15822;height:0;visibility:visible;mso-wrap-style:square" o:connectortype="straight" o:gfxdata="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" strokecolor="#31849b">
+                    <v:stroke startarrowwidth="narrow" startarrowlength="short" endarrowwidth="narrow" endarrowlength="short"/>
+                  </v:shape>
+                  <v:rect id="Rectángulo 381389555" o:spid="_x0000_s1043" style="position:absolute;left:8;top:9;width:4031;height:1439;visibility:visible;mso-wrap-style:square;v-text-anchor:middle" o:gfxdata="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" filled="f" stroked="f">
+                    <v:textbox inset="2.53958mm,2.53958mm,2.53958mm,2.53958mm">
+                      <w:txbxContent>
+                        <w:p>
+                          <w:pPr>
+                            <w:spacing w:before="0" w:line="240" w:lineRule="auto"/>
+                            <w:ind w:left="0" w:hanging="357"/>
+                            <w:textDirection w:val="btLr"/>
+                          </w:pPr>
+                        </w:p>
+                      </w:txbxContent>
+                    </v:textbox>
+                  </v:rect>
+                </v:group>
+              </v:group>
+              <w10:wrap anchorx="page" anchory="page"/>
+            </v:group>
+          </w:pict>
         </mc:Fallback>
       </mc:AlternateContent>
     </w:r>
@@ -4203,18 +4226,8 @@
 </w:hdr>
 </file>
 
-<file path=word/header3.xml><?xml version="1.0" encoding="utf-8"?>
-<w:hdr xmlns:wpc="http://schemas.microsoft.com/office/word/2010/wordprocessingCanvas" xmlns:cx="http://schemas.microsoft.com/office/drawing/2014/chartex" xmlns:cx1="http://schemas.microsoft.com/office/drawing/2015/9/8/chartex" xmlns:cx2="http://schemas.microsoft.com/office/drawing/2015/10/21/chartex" xmlns:cx3="http://schemas.microsoft.com/office/drawing/2016/5/9/chartex" xmlns:cx4="http://schemas.microsoft.com/office/drawing/2016/5/10/chartex" xmlns:cx5="http://schemas.microsoft.com/office/drawing/2016/5/11/chartex" xmlns:cx6="http://schemas.microsoft.com/office/drawing/2016/5/12/chartex" xmlns:cx7="http://schemas.microsoft.com/office/drawing/2016/5/13/chartex" xmlns:cx8="http://schemas.microsoft.com/office/drawing/2016/5/14/chartex" xmlns:mc="http://schemas.openxmlformats.org/markup-compatibility/2006" xmlns:aink="http://schemas.microsoft.com/office/drawing/2016/ink" xmlns:am3d="http://schemas.microsoft.com/office/drawing/2017/model3d" xmlns:o="urn:schemas-microsoft-com:office:office" xmlns:oel="http://schemas.microsoft.com/office/2019/extlst" xmlns:r="http://schemas.openxmlformats.org/officeDocument/2006/relationships" xmlns:m="http://schemas.openxmlformats.org/officeDocument/2006/math" xmlns:v="urn:schemas-microsoft-com:vml" xmlns:wp14="http://schemas.microsoft.com/office/word/2010/wordprocessingDrawing" xmlns:wp="http://schemas.openxmlformats.org/drawingml/2006/wordprocessingDrawing" xmlns:w10="urn:schemas-microsoft-com:office:word" xmlns:w="http://schemas.openxmlformats.org/wordprocessingml/2006/main" xmlns:w14="http://schemas.microsoft.com/office/word/2010/wordml" xmlns:w15="http://schemas.microsoft.com/office/word/2012/wordml" xmlns:w16cex="http://schemas.microsoft.com/office/word/2018/wordml/cex" xmlns:w16cid="http://schemas.microsoft.com/office/word/2016/wordml/cid" xmlns:w16="http://schemas.microsoft.com/office/word/2018/wordml" xmlns:w16du="http://schemas.microsoft.com/office/word/2023/wordml/word16du" xmlns:w16sdtdh="http://schemas.microsoft.com/office/word/2020/wordml/sdtdatahash" xmlns:w16sdtfl="http://schemas.microsoft.com/office/word/2024/wordml/sdtformatlock" xmlns:w16se="http://schemas.microsoft.com/office/word/2015/wordml/symex" xmlns:wpg="http://schemas.microsoft.com/office/word/2010/wordprocessingGroup" xmlns:wpi="http://schemas.microsoft.com/office/word/2010/wordprocessingInk" xmlns:wne="http://schemas.microsoft.com/office/word/2006/wordml" xmlns:wps="http://schemas.microsoft.com/office/word/2010/wordprocessingShape" mc:Ignorable="w14 w15 w16se w16cid w16 w16cex w16sdtdh w16sdtfl w16du wp14">
-  <w:p>
-    <w:pPr>
-      <w:pStyle w:val="Encabezado"/>
-    </w:pPr>
-  </w:p>
-</w:hdr>
-</file>
-
 <file path=word/numbering.xml><?xml version="1.0" encoding="utf-8"?>
-<w:numbering xmlns:wpc="http://schemas.microsoft.com/office/word/2010/wordprocessingCanvas" xmlns:cx="http://schemas.microsoft.com/office/drawing/2014/chartex" xmlns:cx1="http://schemas.microsoft.com/office/drawing/2015/9/8/chartex" xmlns:cx2="http://schemas.microsoft.com/office/drawing/2015/10/21/chartex" xmlns:cx3="http://schemas.microsoft.com/office/drawing/2016/5/9/chartex" xmlns:cx4="http://schemas.microsoft.com/office/drawing/2016/5/10/chartex" xmlns:cx5="http://schemas.microsoft.com/office/drawing/2016/5/11/chartex" xmlns:cx6="http://schemas.microsoft.com/office/drawing/2016/5/12/chartex" xmlns:cx7="http://schemas.microsoft.com/office/drawing/2016/5/13/chartex" xmlns:cx8="http://schemas.microsoft.com/office/drawing/2016/5/14/chartex" xmlns:mc="http://schemas.openxmlformats.org/markup-compatibility/2006" xmlns:aink="http://schemas.microsoft.com/office/drawing/2016/ink" xmlns:am3d="http://schemas.microsoft.com/office/drawing/2017/model3d" xmlns:o="urn:schemas-microsoft-com:office:office" xmlns:oel="http://schemas.microsoft.com/office/2019/extlst" xmlns:r="http://schemas.openxmlformats.org/officeDocument/2006/relationships" xmlns:m="http://schemas.openxmlformats.org/officeDocument/2006/math" xmlns:v="urn:schemas-microsoft-com:vml" xmlns:wp14="http://schemas.microsoft.com/office/word/2010/wordprocessingDrawing" xmlns:wp="http://schemas.openxmlformats.org/drawingml/2006/wordprocessingDrawing" xmlns:w10="urn:schemas-microsoft-com:office:word" xmlns:w="http://schemas.openxmlformats.org/wordprocessingml/2006/main" xmlns:w14="http://schemas.microsoft.com/office/word/2010/wordml" xmlns:w15="http://schemas.microsoft.com/office/word/2012/wordml" xmlns:w16cex="http://schemas.microsoft.com/office/word/2018/wordml/cex" xmlns:w16cid="http://schemas.microsoft.com/office/word/2016/wordml/cid" xmlns:w16="http://schemas.microsoft.com/office/word/2018/wordml" xmlns:w16du="http://schemas.microsoft.com/office/word/2023/wordml/word16du" xmlns:w16sdtdh="http://schemas.microsoft.com/office/word/2020/wordml/sdtdatahash" xmlns:w16sdtfl="http://schemas.microsoft.com/office/word/2024/wordml/sdtformatlock" xmlns:w16se="http://schemas.microsoft.com/office/word/2015/wordml/symex" xmlns:wpg="http://schemas.microsoft.com/office/word/2010/wordprocessingGroup" xmlns:wpi="http://schemas.microsoft.com/office/word/2010/wordprocessingInk" xmlns:wne="http://schemas.microsoft.com/office/word/2006/wordml" xmlns:wps="http://schemas.microsoft.com/office/word/2010/wordprocessingShape" mc:Ignorable="w14 w15 w16se w16cid w16 w16cex w16sdtdh w16sdtfl w16du wp14">
+<w:numbering xmlns:wpc="http://schemas.microsoft.com/office/word/2010/wordprocessingCanvas" xmlns:cx="http://schemas.microsoft.com/office/drawing/2014/chartex" xmlns:cx1="http://schemas.microsoft.com/office/drawing/2015/9/8/chartex" xmlns:cx2="http://schemas.microsoft.com/office/drawing/2015/10/21/chartex" xmlns:cx3="http://schemas.microsoft.com/office/drawing/2016/5/9/chartex" xmlns:cx4="http://schemas.microsoft.com/office/drawing/2016/5/10/chartex" xmlns:cx5="http://schemas.microsoft.com/office/drawing/2016/5/11/chartex" xmlns:cx6="http://schemas.microsoft.com/office/drawing/2016/5/12/chartex" xmlns:cx7="http://schemas.microsoft.com/office/drawing/2016/5/13/chartex" xmlns:cx8="http://schemas.microsoft.com/office/drawing/2016/5/14/chartex" xmlns:mc="http://schemas.openxmlformats.org/markup-compatibility/2006" xmlns:aink="http://schemas.microsoft.com/office/drawing/2016/ink" xmlns:am3d="http://schemas.microsoft.com/office/drawing/2017/model3d" xmlns:o="urn:schemas-microsoft-com:office:office" xmlns:r="http://schemas.openxmlformats.org/officeDocument/2006/relationships" xmlns:m="http://schemas.openxmlformats.org/officeDocument/2006/math" xmlns:v="urn:schemas-microsoft-com:vml" xmlns:wp14="http://schemas.microsoft.com/office/word/2010/wordprocessingDrawing" xmlns:wp="http://schemas.openxmlformats.org/drawingml/2006/wordprocessingDrawing" xmlns:w10="urn:schemas-microsoft-com:office:word" xmlns:w="http://schemas.openxmlformats.org/wordprocessingml/2006/main" xmlns:w14="http://schemas.microsoft.com/office/word/2010/wordml" xmlns:w15="http://schemas.microsoft.com/office/word/2012/wordml" xmlns:w16cid="http://schemas.microsoft.com/office/word/2016/wordml/cid" xmlns:w16se="http://schemas.microsoft.com/office/word/2015/wordml/symex" xmlns:wpg="http://schemas.microsoft.com/office/word/2010/wordprocessingGroup" xmlns:wpi="http://schemas.microsoft.com/office/word/2010/wordprocessingInk" xmlns:wne="http://schemas.microsoft.com/office/word/2006/wordml" xmlns:wps="http://schemas.microsoft.com/office/word/2010/wordprocessingShape" mc:Ignorable="w14 w15 w16se w16cid wp14">
   <w:abstractNum w:abstractNumId="0" w15:restartNumberingAfterBreak="0">
     <w:nsid w:val="018F7D62"/>
     <w:multiLevelType w:val="multilevel"/>
@@ -4668,23 +4681,23 @@
       </w:rPr>
     </w:lvl>
   </w:abstractNum>
-  <w:num w:numId="1" w16cid:durableId="1118834402">
+  <w:num w:numId="1">
     <w:abstractNumId w:val="3"/>
   </w:num>
-  <w:num w:numId="2" w16cid:durableId="1531722911">
+  <w:num w:numId="2">
     <w:abstractNumId w:val="0"/>
   </w:num>
-  <w:num w:numId="3" w16cid:durableId="1793130820">
+  <w:num w:numId="3">
     <w:abstractNumId w:val="1"/>
   </w:num>
-  <w:num w:numId="4" w16cid:durableId="813333878">
+  <w:num w:numId="4">
     <w:abstractNumId w:val="2"/>
   </w:num>
 </w:numbering>
 </file>
 
 <file path=word/styles.xml><?xml version="1.0" encoding="utf-8"?>
-<w:styles xmlns:mc="http://schemas.openxmlformats.org/markup-compatibility/2006" xmlns:r="http://schemas.openxmlformats.org/officeDocument/2006/relationships" xmlns:w="http://schemas.openxmlformats.org/wordprocessingml/2006/main" xmlns:w14="http://schemas.microsoft.com/office/word/2010/wordml" xmlns:w15="http://schemas.microsoft.com/office/word/2012/wordml" xmlns:w16cex="http://schemas.microsoft.com/office/word/2018/wordml/cex" xmlns:w16cid="http://schemas.microsoft.com/office/word/2016/wordml/cid" xmlns:w16="http://schemas.microsoft.com/office/word/2018/wordml" xmlns:w16du="http://schemas.microsoft.com/office/word/2023/wordml/word16du" xmlns:w16sdtdh="http://schemas.microsoft.com/office/word/2020/wordml/sdtdatahash" xmlns:w16sdtfl="http://schemas.microsoft.com/office/word/2024/wordml/sdtformatlock" xmlns:w16se="http://schemas.microsoft.com/office/word/2015/wordml/symex" mc:Ignorable="w14 w15 w16se w16cid w16 w16cex w16sdtdh w16sdtfl w16du">
+<w:styles xmlns:mc="http://schemas.openxmlformats.org/markup-compatibility/2006" xmlns:r="http://schemas.openxmlformats.org/officeDocument/2006/relationships" xmlns:w="http://schemas.openxmlformats.org/wordprocessingml/2006/main" xmlns:w14="http://schemas.microsoft.com/office/word/2010/wordml" xmlns:w15="http://schemas.microsoft.com/office/word/2012/wordml" xmlns:w16cid="http://schemas.microsoft.com/office/word/2016/wordml/cid" xmlns:w16se="http://schemas.microsoft.com/office/word/2015/wordml/symex" mc:Ignorable="w14 w15 w16se w16cid">
   <w:docDefaults>
     <w:rPrDefault>
       <w:rPr>
@@ -4701,7 +4714,7 @@
       </w:pPr>
     </w:pPrDefault>
   </w:docDefaults>
-  <w:latentStyles w:defLockedState="0" w:defUIPriority="99" w:defSemiHidden="0" w:defUnhideWhenUsed="0" w:defQFormat="0" w:count="376">
+  <w:latentStyles w:defLockedState="0" w:defUIPriority="99" w:defSemiHidden="0" w:defUnhideWhenUsed="0" w:defQFormat="0" w:count="375">
     <w:lsdException w:name="Normal" w:uiPriority="0" w:qFormat="1"/>
     <w:lsdException w:name="heading 1" w:uiPriority="9" w:qFormat="1"/>
     <w:lsdException w:name="heading 2" w:semiHidden="1" w:uiPriority="9" w:unhideWhenUsed="1" w:qFormat="1"/>
@@ -5077,7 +5090,6 @@
     <w:lsdException w:name="Smart Hyperlink" w:semiHidden="1" w:unhideWhenUsed="1"/>
     <w:lsdException w:name="Hashtag" w:semiHidden="1" w:unhideWhenUsed="1"/>
     <w:lsdException w:name="Unresolved Mention" w:semiHidden="1" w:unhideWhenUsed="1"/>
-    <w:lsdException w:name="Smart Link" w:semiHidden="1" w:unhideWhenUsed="1"/>
   </w:latentStyles>
   <w:style w:type="paragraph" w:default="1" w:styleId="Normal">
     <w:name w:val="Normal"/>

</xml_diff>